<commit_message>
Final reviews: fix Review 1, add evidence appendices, rebuild combined PDF
- Review 1: corrected claims that disagreed with the code (no integrity auditing,
  encryption provided not mandated, Python 3.8+ tested on 3.14, zip via zipfile,
  current model names, reference links)
- Appendix A/B/C in Reviews 1-3: real terminal captures, source excerpts with
  line numbers, commit history per stage, full test run, GitHub install check
- Combined PDF: cover with contents, page numbers, bookmarks (41 pages)

Co-Authored-By: Claude Opus 5.5 <noreply@anthropic.com>
</commit_message>
<xml_diff>
--- a/docs/Review_1_Smart_Archive_Agent.docx
+++ b/docs/Review_1_Smart_Archive_Agent.docx
@@ -260,7 +260,7 @@
           <w:color w:val="3C3C3C"/>
           <w:sz w:val="22"/>
         </w:rPr>
-        <w:t>Recent advancements in Natural Language Processing (NLP) and Large Language Models (LLMs) have sparked a paradigm shift in human-computer interaction. Instead of burdening system operators and developers with memorizing complex argument vectors, modern system tooling is moving toward 'Agentic Shells'—intelligent agents capable of understanding high-level human intent and translating natural language into safe, verifiable system calls. Within this ecosystem, the Smart Archive Agent serves as a specialized, autonomous specialist dedicated to the storage and archiving domain, providing safe file packaging, compression, decompression, integrity auditing, and cryptographic protection on Ubuntu Linux.</w:t>
+        <w:t>Recent advancements in Natural Language Processing (NLP) and Large Language Models (LLMs) have sparked a paradigm shift in human-computer interaction. Instead of burdening system operators and developers with memorizing complex argument vectors, modern system tooling is moving toward 'Agentic Shells'—intelligent agents capable of understanding high-level human intent and translating natural language into safe, verifiable system calls. Within this ecosystem, the Smart Archive Agent serves as a specialized, autonomous specialist dedicated to the storage and archiving domain, providing safe file packaging, compression, decompression, inspection, and cryptographic protection on Ubuntu Linux.</w:t>
       </w:r>
     </w:p>
     <w:p>
@@ -331,7 +331,7 @@
           <w:color w:val="3C3C3C"/>
           <w:sz w:val="22"/>
         </w:rPr>
-        <w:t>Executing erroneous archive commands in shell environments carries acute operational risks. A common mistake is argument inversion (e.g., swapping source and destination paths in tar), which can completely overwrite critical source directories with empty archives. Similarly, unvetted extraction commands can trigger path traversal vulnerabilities (Zip Slip) or overwrite existing production files. The Smart Archive Agent addresses these risks by providing a safe translation layer that dispatches only into bounded, pre-validated functions with explicit path verification and strict non-overwrite rules.</w:t>
+        <w:t>Executing erroneous archive commands in shell environments carries acute operational risks. A common mistake is argument inversion (e.g., swapping source and destination paths in tar), which can silently overwrite a source file with an empty archive (demonstrated in Appendix A, Figure A.2). Similarly, unvetted extraction commands can trigger path traversal vulnerabilities (Zip Slip) or overwrite existing production files. The Smart Archive Agent addresses these risks by providing a safe translation layer that dispatches only into bounded, pre-validated functions with explicit path verification and strict non-overwrite rules.</w:t>
       </w:r>
     </w:p>
     <w:p>
@@ -438,7 +438,7 @@
           <w:color w:val="3C3C3C"/>
           <w:sz w:val="22"/>
         </w:rPr>
-        <w:t>To implement robust path validation, prevent Zip Slip directory traversal attacks, prevent accidental file overwrites, and mandate AES-256 GPG encryption for sensitive storage.</w:t>
+        <w:t>To implement robust path validation, prevent Zip Slip directory traversal attacks, prevent accidental file overwrites, and provide AES-256 GPG encryption for sensitive files.</w:t>
       </w:r>
     </w:p>
     <w:p>
@@ -453,7 +453,7 @@
           <w:color w:val="3C3C3C"/>
           <w:sz w:val="22"/>
         </w:rPr>
-        <w:t xml:space="preserve">Structured Feedback &amp; Auditing: </w:t>
+        <w:t xml:space="preserve">Structured Feedback: </w:t>
       </w:r>
       <w:r>
         <w:rPr>
@@ -499,7 +499,7 @@
           <w:color w:val="3C3C3C"/>
           <w:sz w:val="22"/>
         </w:rPr>
-        <w:t>The Smart Archive Agent is natively targeted for Ubuntu Linux and Windows Subsystem for Linux (WSL 2). It leverages standard Linux binaries (tar, gzip, bzip2, xz, file, gpg, zip, unzip) and Python 3.14.</w:t>
+        <w:t>The Smart Archive Agent is natively targeted for Ubuntu Linux and Windows Subsystem for Linux (WSL 2). It uses standard Linux binaries (tar, gzip, bzip2, xz, file, gpg) and Python (written for 3.8 or newer, tested on 3.14); zip archives are handled by Python's built-in zipfile module.</w:t>
       </w:r>
     </w:p>
     <w:p>
@@ -626,7 +626,7 @@
           <w:color w:val="3C3C3C"/>
           <w:sz w:val="22"/>
         </w:rPr>
-        <w:t>Recent frontier models (such as GPT-4, Claude 3.5, and Gemini Pro) have demonstrated remarkable capabilities in translating unstructured natural language into structured outputs, API payloads, and executable code. Function calling and structured tool outputs enable language models to extract entities from natural text and populate predefined JSON schemas with high fidelity. In system administration, this capability enables flexible intent detection across diverse phrasings and languages.</w:t>
+        <w:t>Current frontier model families (such as OpenAI GPT, Anthropic Claude and Google Gemini) have demonstrated remarkable capabilities in translating unstructured natural language into structured outputs, API payloads, and executable code. Function calling and structured tool outputs enable language models to extract entities from natural text and populate predefined JSON schemas with high fidelity. In system administration, this capability enables flexible intent detection across diverse phrasings and languages.</w:t>
       </w:r>
     </w:p>
     <w:p>
@@ -1229,7 +1229,7 @@
           <w:color w:val="3C3C3C"/>
           <w:sz w:val="22"/>
         </w:rPr>
-        <w:t>[1] Anthropic, 'Model Context Protocol (MCP) Specification,' 2024. [Online]. Available: https://github.com/modelcontextprotocol/docs</w:t>
+        <w:t>[1] Anthropic, 'Model Context Protocol (MCP) Specification,' 2024. [Online]. Available: https://modelcontextprotocol.io/</w:t>
       </w:r>
     </w:p>
     <w:p>
@@ -1242,7 +1242,7 @@
           <w:color w:val="3C3C3C"/>
           <w:sz w:val="22"/>
         </w:rPr>
-        <w:t>[2] OpenAI, 'Function Calling and Structured Outputs Guide,' 2024. [Online]. Available: https://developers.openai.com/api/docs/guides/function-calling</w:t>
+        <w:t>[2] OpenAI, 'Function Calling and Structured Outputs Guide,' 2024. [Online]. Available: https://platform.openai.com/docs/guides/function-calling</w:t>
       </w:r>
     </w:p>
     <w:p>
@@ -1283,6 +1283,1982 @@
         </w:rPr>
         <w:t>[5] GitHub Inc., 'GitHub Copilot in the CLI Documentation,' 2024. [Online]. Available: https://docs.github.com/en/copilot/using-github-copilot-in-the-cli</w:t>
       </w:r>
+    </w:p>
+    <w:p>
+      <w:pPr>
+        <w:keepNext/>
+        <w:pageBreakBefore/>
+        <w:spacing w:after="160" w:before="280"/>
+      </w:pPr>
+      <w:r>
+        <w:rPr>
+          <w:rFonts w:ascii="Calibri" w:hAnsi="Calibri"/>
+          <w:b/>
+          <w:i w:val="0"/>
+          <w:sz w:val="32"/>
+        </w:rPr>
+        <w:t>Appendix A: Evidence of Work — Review 1 Stage</w:t>
+      </w:r>
+    </w:p>
+    <w:p>
+      <w:pPr>
+        <w:spacing w:after="120"/>
+      </w:pPr>
+      <w:r>
+        <w:rPr>
+          <w:rFonts w:ascii="Calibri" w:hAnsi="Calibri"/>
+          <w:b w:val="0"/>
+          <w:i w:val="0"/>
+          <w:sz w:val="22"/>
+        </w:rPr>
+        <w:t>This appendix records evidence from the first stage of the project (problem analysis, environment set-up and the first version of the code). All terminal output is captured from our development machine; the repository is public at https://github.com/redrighthand2007/OS-SMART-ARCHIVE-AGENT, so every commit listed can be inspected.</w:t>
+      </w:r>
+    </w:p>
+    <w:p>
+      <w:pPr>
+        <w:keepNext/>
+        <w:spacing w:after="120" w:before="200"/>
+      </w:pPr>
+      <w:r>
+        <w:rPr>
+          <w:rFonts w:ascii="Calibri" w:hAnsi="Calibri"/>
+          <w:b/>
+          <w:i w:val="0"/>
+          <w:sz w:val="26"/>
+        </w:rPr>
+        <w:t>A.1 Development Environment</w:t>
+      </w:r>
+    </w:p>
+    <w:p>
+      <w:pPr>
+        <w:spacing w:after="120"/>
+      </w:pPr>
+      <w:r>
+        <w:rPr>
+          <w:rFonts w:ascii="Calibri" w:hAnsi="Calibri"/>
+          <w:b w:val="0"/>
+          <w:i w:val="0"/>
+          <w:sz w:val="22"/>
+        </w:rPr>
+        <w:t>The project was developed and tested on Ubuntu inside Windows Subsystem for Linux 2, using the standard archive and encryption utilities that ship with Ubuntu.</w:t>
+      </w:r>
+    </w:p>
+    <w:p>
+      <w:pPr>
+        <w:keepNext/>
+        <w:spacing w:after="40"/>
+        <w:jc w:val="center"/>
+      </w:pPr>
+      <w:r>
+        <w:drawing>
+          <wp:inline xmlns:a="http://schemas.openxmlformats.org/drawingml/2006/main" xmlns:pic="http://schemas.openxmlformats.org/drawingml/2006/picture">
+            <wp:extent cx="5943600" cy="1978918"/>
+            <wp:docPr id="1" name="Picture 1"/>
+            <wp:cNvGraphicFramePr>
+              <a:graphicFrameLocks noChangeAspect="1"/>
+            </wp:cNvGraphicFramePr>
+            <a:graphic>
+              <a:graphicData uri="http://schemas.openxmlformats.org/drawingml/2006/picture">
+                <pic:pic>
+                  <pic:nvPicPr>
+                    <pic:cNvPr id="0" name="A1.png"/>
+                    <pic:cNvPicPr/>
+                  </pic:nvPicPr>
+                  <pic:blipFill>
+                    <a:blip r:embed="rId9"/>
+                    <a:stretch>
+                      <a:fillRect/>
+                    </a:stretch>
+                  </pic:blipFill>
+                  <pic:spPr>
+                    <a:xfrm>
+                      <a:off x="0" y="0"/>
+                      <a:ext cx="5943600" cy="1978918"/>
+                    </a:xfrm>
+                    <a:prstGeom prst="rect"/>
+                  </pic:spPr>
+                </pic:pic>
+              </a:graphicData>
+            </a:graphic>
+          </wp:inline>
+        </w:drawing>
+      </w:r>
+    </w:p>
+    <w:p>
+      <w:pPr>
+        <w:spacing w:after="200"/>
+        <w:jc w:val="center"/>
+      </w:pPr>
+      <w:r>
+        <w:rPr>
+          <w:rFonts w:ascii="Calibri" w:hAnsi="Calibri"/>
+          <w:b/>
+          <w:i w:val="0"/>
+          <w:sz w:val="20"/>
+        </w:rPr>
+        <w:t>Figure A.1: Operating system, kernel, Python and utility versions on the development machine.</w:t>
+      </w:r>
+    </w:p>
+    <w:p>
+      <w:pPr>
+        <w:keepNext/>
+        <w:spacing w:after="120" w:before="200"/>
+      </w:pPr>
+      <w:r>
+        <w:rPr>
+          <w:rFonts w:ascii="Calibri" w:hAnsi="Calibri"/>
+          <w:b/>
+          <w:i w:val="0"/>
+          <w:sz w:val="26"/>
+        </w:rPr>
+        <w:t>A.2 The Problem Demonstrated with the Raw Linux Tools</w:t>
+      </w:r>
+    </w:p>
+    <w:p>
+      <w:pPr>
+        <w:spacing w:after="120"/>
+      </w:pPr>
+      <w:r>
+        <w:rPr>
+          <w:rFonts w:ascii="Calibri" w:hAnsi="Calibri"/>
+          <w:b w:val="0"/>
+          <w:i w:val="0"/>
+          <w:sz w:val="22"/>
+        </w:rPr>
+        <w:t>To confirm the problem statement in Section 1.2, we reproduced the two most common mistakes with the standard tools in a scratch folder:</w:t>
+      </w:r>
+    </w:p>
+    <w:p>
+      <w:pPr>
+        <w:pStyle w:val="ListBullet"/>
+        <w:spacing w:after="60"/>
+      </w:pPr>
+      <w:r>
+        <w:rPr>
+          <w:rFonts w:ascii="Calibri" w:hAnsi="Calibri"/>
+          <w:b/>
+          <w:i w:val="0"/>
+          <w:sz w:val="22"/>
+        </w:rPr>
+        <w:t>Swapped tar arguments destroy data:</w:t>
+      </w:r>
+      <w:r>
+        <w:rPr>
+          <w:rFonts w:ascii="Calibri" w:hAnsi="Calibri"/>
+          <w:b w:val="0"/>
+          <w:i w:val="0"/>
+          <w:sz w:val="22"/>
+        </w:rPr>
+        <w:t xml:space="preserve"> report.txt contained text; after tar -cJf report.txt backup.tar.xz (source and destination swapped), tar reported an error, but report.txt had already been replaced by an empty xz archive, so the original text is lost.</w:t>
+      </w:r>
+    </w:p>
+    <w:p>
+      <w:pPr>
+        <w:pStyle w:val="ListBullet"/>
+        <w:spacing w:after="60"/>
+      </w:pPr>
+      <w:r>
+        <w:rPr>
+          <w:rFonts w:ascii="Calibri" w:hAnsi="Calibri"/>
+          <w:b/>
+          <w:i w:val="0"/>
+          <w:sz w:val="22"/>
+        </w:rPr>
+        <w:t>xz removes the original:</w:t>
+      </w:r>
+      <w:r>
+        <w:rPr>
+          <w:rFonts w:ascii="Calibri" w:hAnsi="Calibri"/>
+          <w:b w:val="0"/>
+          <w:i w:val="0"/>
+          <w:sz w:val="22"/>
+        </w:rPr>
+        <w:t xml:space="preserve"> xz notes.txt leaves only notes.txt.xz.</w:t>
+      </w:r>
+    </w:p>
+    <w:p>
+      <w:pPr>
+        <w:pStyle w:val="ListBullet"/>
+        <w:spacing w:after="60"/>
+      </w:pPr>
+      <w:r>
+        <w:rPr>
+          <w:rFonts w:ascii="Calibri" w:hAnsi="Calibri"/>
+          <w:b/>
+          <w:i w:val="0"/>
+          <w:sz w:val="22"/>
+        </w:rPr>
+        <w:t>The correct manual chain is long:</w:t>
+      </w:r>
+      <w:r>
+        <w:rPr>
+          <w:rFonts w:ascii="Calibri" w:hAnsi="Calibri"/>
+          <w:b w:val="0"/>
+          <w:i w:val="0"/>
+          <w:sz w:val="22"/>
+        </w:rPr>
+        <w:t xml:space="preserve"> the brief's request (archive heavily, then encrypt, then remove the plaintext) needs three commands and eight flags (XZ_OPT=-9e, -cJf, --batch, --pinentry-mode, --passphrase, --symmetric, --cipher-algo AES256, rm), which the Smart Archive Agent replaces with one sentence.</w:t>
+      </w:r>
+    </w:p>
+    <w:p>
+      <w:pPr>
+        <w:keepNext/>
+        <w:spacing w:after="40"/>
+        <w:jc w:val="center"/>
+      </w:pPr>
+      <w:r>
+        <w:drawing>
+          <wp:inline xmlns:a="http://schemas.openxmlformats.org/drawingml/2006/main" xmlns:pic="http://schemas.openxmlformats.org/drawingml/2006/picture">
+            <wp:extent cx="5943600" cy="2560952"/>
+            <wp:docPr id="2" name="Picture 2"/>
+            <wp:cNvGraphicFramePr>
+              <a:graphicFrameLocks noChangeAspect="1"/>
+            </wp:cNvGraphicFramePr>
+            <a:graphic>
+              <a:graphicData uri="http://schemas.openxmlformats.org/drawingml/2006/picture">
+                <pic:pic>
+                  <pic:nvPicPr>
+                    <pic:cNvPr id="0" name="A3.png"/>
+                    <pic:cNvPicPr/>
+                  </pic:nvPicPr>
+                  <pic:blipFill>
+                    <a:blip r:embed="rId10"/>
+                    <a:stretch>
+                      <a:fillRect/>
+                    </a:stretch>
+                  </pic:blipFill>
+                  <pic:spPr>
+                    <a:xfrm>
+                      <a:off x="0" y="0"/>
+                      <a:ext cx="5943600" cy="2560952"/>
+                    </a:xfrm>
+                    <a:prstGeom prst="rect"/>
+                  </pic:spPr>
+                </pic:pic>
+              </a:graphicData>
+            </a:graphic>
+          </wp:inline>
+        </w:drawing>
+      </w:r>
+    </w:p>
+    <w:p>
+      <w:pPr>
+        <w:spacing w:after="200"/>
+        <w:jc w:val="center"/>
+      </w:pPr>
+      <w:r>
+        <w:rPr>
+          <w:rFonts w:ascii="Calibri" w:hAnsi="Calibri"/>
+          <w:b/>
+          <w:i w:val="0"/>
+          <w:sz w:val="20"/>
+        </w:rPr>
+        <w:t>Figure A.2: Real data loss from swapped tar arguments, xz deleting its input, and the manual command chain for the brief's request.</w:t>
+      </w:r>
+    </w:p>
+    <w:p>
+      <w:pPr>
+        <w:keepNext/>
+        <w:spacing w:after="120" w:before="200"/>
+      </w:pPr>
+      <w:r>
+        <w:rPr>
+          <w:rFonts w:ascii="Calibri" w:hAnsi="Calibri"/>
+          <w:b/>
+          <w:i w:val="0"/>
+          <w:sz w:val="26"/>
+        </w:rPr>
+        <w:t>A.3 Project Repository and Commit History (Stage 1)</w:t>
+      </w:r>
+    </w:p>
+    <w:p>
+      <w:pPr>
+        <w:spacing w:after="120"/>
+      </w:pPr>
+      <w:r>
+        <w:rPr>
+          <w:rFonts w:ascii="Calibri" w:hAnsi="Calibri"/>
+          <w:b w:val="0"/>
+          <w:i w:val="0"/>
+          <w:sz w:val="22"/>
+        </w:rPr>
+        <w:t>The repository was created on 15 October 2026. The first day's commits set up the project base, the first agent core, the first test suite and the documentation, with commits from both team members:</w:t>
+      </w:r>
+    </w:p>
+    <w:p>
+      <w:pPr>
+        <w:keepNext/>
+        <w:spacing w:after="80"/>
+        <w:jc w:val="center"/>
+      </w:pPr>
+      <w:r>
+        <w:rPr>
+          <w:rFonts w:ascii="Calibri" w:hAnsi="Calibri"/>
+          <w:b/>
+          <w:i w:val="0"/>
+          <w:sz w:val="20"/>
+        </w:rPr>
+        <w:t>Table A.1: Commits of 15 October 2026 (from git log on the public repository).</w:t>
+      </w:r>
+    </w:p>
+    <w:tbl>
+      <w:tblPr>
+        <w:tblW w:type="auto" w:w="0"/>
+        <w:tblLook w:firstColumn="1" w:firstRow="1" w:lastColumn="0" w:lastRow="0" w:noHBand="0" w:noVBand="1" w:val="04A0"/>
+        <w:jc w:val="center"/>
+        <w:tblLayout w:type="fixed"/>
+        <w:tblBorders>
+          <w:top w:val="single" w:sz="4" w:space="0" w:color="BFBFBF"/>
+          <w:left w:val="single" w:sz="4" w:space="0" w:color="BFBFBF"/>
+          <w:bottom w:val="single" w:sz="4" w:space="0" w:color="BFBFBF"/>
+          <w:right w:val="single" w:sz="4" w:space="0" w:color="BFBFBF"/>
+          <w:insideH w:val="single" w:sz="4" w:space="0" w:color="BFBFBF"/>
+          <w:insideV w:val="single" w:sz="4" w:space="0" w:color="BFBFBF"/>
+        </w:tblBorders>
+      </w:tblPr>
+      <w:tblGrid>
+        <w:gridCol w:w="1100"/>
+        <w:gridCol w:w="1900"/>
+        <w:gridCol w:w="1700"/>
+        <w:gridCol w:w="2900"/>
+        <w:gridCol w:w="1760"/>
+      </w:tblGrid>
+      <w:tr>
+        <w:trPr>
+          <w:tblHeader/>
+          <w:cantSplit/>
+        </w:trPr>
+        <w:tc>
+          <w:tcPr>
+            <w:tcW w:type="dxa" w:w="1100"/>
+            <w:shd w:val="clear" w:color="auto" w:fill="1F497D"/>
+            <w:tcMar>
+              <w:top w:w="80" w:type="dxa"/>
+              <w:bottom w:w="80" w:type="dxa"/>
+              <w:left w:w="100" w:type="dxa"/>
+              <w:right w:w="100" w:type="dxa"/>
+            </w:tcMar>
+          </w:tcPr>
+          <w:p>
+            <w:pPr>
+              <w:keepNext/>
+              <w:spacing w:after="0"/>
+            </w:pPr>
+            <w:r>
+              <w:rPr>
+                <w:rFonts w:ascii="Calibri" w:hAnsi="Calibri"/>
+                <w:b/>
+                <w:i w:val="0"/>
+                <w:color w:val="FFFFFF"/>
+                <w:sz w:val="19"/>
+              </w:rPr>
+              <w:t>Commit</w:t>
+            </w:r>
+          </w:p>
+        </w:tc>
+        <w:tc>
+          <w:tcPr>
+            <w:tcW w:type="dxa" w:w="1900"/>
+            <w:shd w:val="clear" w:color="auto" w:fill="1F497D"/>
+            <w:tcMar>
+              <w:top w:w="80" w:type="dxa"/>
+              <w:bottom w:w="80" w:type="dxa"/>
+              <w:left w:w="100" w:type="dxa"/>
+              <w:right w:w="100" w:type="dxa"/>
+            </w:tcMar>
+          </w:tcPr>
+          <w:p>
+            <w:pPr>
+              <w:keepNext/>
+              <w:spacing w:after="0"/>
+            </w:pPr>
+            <w:r>
+              <w:rPr>
+                <w:rFonts w:ascii="Calibri" w:hAnsi="Calibri"/>
+                <w:b/>
+                <w:i w:val="0"/>
+                <w:color w:val="FFFFFF"/>
+                <w:sz w:val="19"/>
+              </w:rPr>
+              <w:t>Date and time</w:t>
+            </w:r>
+          </w:p>
+        </w:tc>
+        <w:tc>
+          <w:tcPr>
+            <w:tcW w:type="dxa" w:w="1700"/>
+            <w:shd w:val="clear" w:color="auto" w:fill="1F497D"/>
+            <w:tcMar>
+              <w:top w:w="80" w:type="dxa"/>
+              <w:bottom w:w="80" w:type="dxa"/>
+              <w:left w:w="100" w:type="dxa"/>
+              <w:right w:w="100" w:type="dxa"/>
+            </w:tcMar>
+          </w:tcPr>
+          <w:p>
+            <w:pPr>
+              <w:keepNext/>
+              <w:spacing w:after="0"/>
+            </w:pPr>
+            <w:r>
+              <w:rPr>
+                <w:rFonts w:ascii="Calibri" w:hAnsi="Calibri"/>
+                <w:b/>
+                <w:i w:val="0"/>
+                <w:color w:val="FFFFFF"/>
+                <w:sz w:val="19"/>
+              </w:rPr>
+              <w:t>Author</w:t>
+            </w:r>
+          </w:p>
+        </w:tc>
+        <w:tc>
+          <w:tcPr>
+            <w:tcW w:type="dxa" w:w="2900"/>
+            <w:shd w:val="clear" w:color="auto" w:fill="1F497D"/>
+            <w:tcMar>
+              <w:top w:w="80" w:type="dxa"/>
+              <w:bottom w:w="80" w:type="dxa"/>
+              <w:left w:w="100" w:type="dxa"/>
+              <w:right w:w="100" w:type="dxa"/>
+            </w:tcMar>
+          </w:tcPr>
+          <w:p>
+            <w:pPr>
+              <w:keepNext/>
+              <w:spacing w:after="0"/>
+            </w:pPr>
+            <w:r>
+              <w:rPr>
+                <w:rFonts w:ascii="Calibri" w:hAnsi="Calibri"/>
+                <w:b/>
+                <w:i w:val="0"/>
+                <w:color w:val="FFFFFF"/>
+                <w:sz w:val="19"/>
+              </w:rPr>
+              <w:t>Change</w:t>
+            </w:r>
+          </w:p>
+        </w:tc>
+        <w:tc>
+          <w:tcPr>
+            <w:tcW w:type="dxa" w:w="1760"/>
+            <w:shd w:val="clear" w:color="auto" w:fill="1F497D"/>
+            <w:tcMar>
+              <w:top w:w="80" w:type="dxa"/>
+              <w:bottom w:w="80" w:type="dxa"/>
+              <w:left w:w="100" w:type="dxa"/>
+              <w:right w:w="100" w:type="dxa"/>
+            </w:tcMar>
+          </w:tcPr>
+          <w:p>
+            <w:pPr>
+              <w:keepNext/>
+              <w:spacing w:after="0"/>
+            </w:pPr>
+            <w:r>
+              <w:rPr>
+                <w:rFonts w:ascii="Calibri" w:hAnsi="Calibri"/>
+                <w:b/>
+                <w:i w:val="0"/>
+                <w:color w:val="FFFFFF"/>
+                <w:sz w:val="19"/>
+              </w:rPr>
+              <w:t>Size</w:t>
+            </w:r>
+          </w:p>
+        </w:tc>
+      </w:tr>
+      <w:tr>
+        <w:trPr>
+          <w:cantSplit/>
+        </w:trPr>
+        <w:tc>
+          <w:tcPr>
+            <w:tcW w:type="dxa" w:w="1100"/>
+            <w:shd w:val="clear" w:color="auto" w:fill="FFFFFF"/>
+            <w:tcMar>
+              <w:top w:w="80" w:type="dxa"/>
+              <w:bottom w:w="80" w:type="dxa"/>
+              <w:left w:w="100" w:type="dxa"/>
+              <w:right w:w="100" w:type="dxa"/>
+            </w:tcMar>
+          </w:tcPr>
+          <w:p>
+            <w:pPr>
+              <w:spacing w:after="0"/>
+            </w:pPr>
+            <w:r>
+              <w:rPr>
+                <w:rFonts w:ascii="Calibri" w:hAnsi="Calibri"/>
+                <w:b/>
+                <w:i w:val="0"/>
+                <w:sz w:val="19"/>
+              </w:rPr>
+              <w:t>e1f4d65</w:t>
+            </w:r>
+          </w:p>
+        </w:tc>
+        <w:tc>
+          <w:tcPr>
+            <w:tcW w:type="dxa" w:w="1900"/>
+            <w:shd w:val="clear" w:color="auto" w:fill="FFFFFF"/>
+            <w:tcMar>
+              <w:top w:w="80" w:type="dxa"/>
+              <w:bottom w:w="80" w:type="dxa"/>
+              <w:left w:w="100" w:type="dxa"/>
+              <w:right w:w="100" w:type="dxa"/>
+            </w:tcMar>
+          </w:tcPr>
+          <w:p>
+            <w:pPr>
+              <w:spacing w:after="0"/>
+            </w:pPr>
+            <w:r>
+              <w:rPr>
+                <w:rFonts w:ascii="Calibri" w:hAnsi="Calibri"/>
+                <w:b w:val="0"/>
+                <w:i w:val="0"/>
+                <w:sz w:val="19"/>
+              </w:rPr>
+              <w:t>15 Oct 2026 20:08</w:t>
+            </w:r>
+          </w:p>
+        </w:tc>
+        <w:tc>
+          <w:tcPr>
+            <w:tcW w:type="dxa" w:w="1700"/>
+            <w:shd w:val="clear" w:color="auto" w:fill="FFFFFF"/>
+            <w:tcMar>
+              <w:top w:w="80" w:type="dxa"/>
+              <w:bottom w:w="80" w:type="dxa"/>
+              <w:left w:w="100" w:type="dxa"/>
+              <w:right w:w="100" w:type="dxa"/>
+            </w:tcMar>
+          </w:tcPr>
+          <w:p>
+            <w:pPr>
+              <w:spacing w:after="0"/>
+            </w:pPr>
+            <w:r>
+              <w:rPr>
+                <w:rFonts w:ascii="Calibri" w:hAnsi="Calibri"/>
+                <w:b w:val="0"/>
+                <w:i w:val="0"/>
+                <w:sz w:val="19"/>
+              </w:rPr>
+              <w:t>KUSH AGHERA</w:t>
+            </w:r>
+          </w:p>
+        </w:tc>
+        <w:tc>
+          <w:tcPr>
+            <w:tcW w:type="dxa" w:w="2900"/>
+            <w:shd w:val="clear" w:color="auto" w:fill="FFFFFF"/>
+            <w:tcMar>
+              <w:top w:w="80" w:type="dxa"/>
+              <w:bottom w:w="80" w:type="dxa"/>
+              <w:left w:w="100" w:type="dxa"/>
+              <w:right w:w="100" w:type="dxa"/>
+            </w:tcMar>
+          </w:tcPr>
+          <w:p>
+            <w:pPr>
+              <w:spacing w:after="0"/>
+            </w:pPr>
+            <w:r>
+              <w:rPr>
+                <w:rFonts w:ascii="Calibri" w:hAnsi="Calibri"/>
+                <w:b w:val="0"/>
+                <w:i w:val="0"/>
+                <w:sz w:val="19"/>
+              </w:rPr>
+              <w:t>Initial commit</w:t>
+            </w:r>
+          </w:p>
+        </w:tc>
+        <w:tc>
+          <w:tcPr>
+            <w:tcW w:type="dxa" w:w="1760"/>
+            <w:shd w:val="clear" w:color="auto" w:fill="FFFFFF"/>
+            <w:tcMar>
+              <w:top w:w="80" w:type="dxa"/>
+              <w:bottom w:w="80" w:type="dxa"/>
+              <w:left w:w="100" w:type="dxa"/>
+              <w:right w:w="100" w:type="dxa"/>
+            </w:tcMar>
+          </w:tcPr>
+          <w:p>
+            <w:pPr>
+              <w:spacing w:after="0"/>
+            </w:pPr>
+            <w:r>
+              <w:rPr>
+                <w:rFonts w:ascii="Calibri" w:hAnsi="Calibri"/>
+                <w:b w:val="0"/>
+                <w:i w:val="0"/>
+                <w:sz w:val="19"/>
+              </w:rPr>
+              <w:t>1 file, +1 / −0 lines</w:t>
+            </w:r>
+          </w:p>
+        </w:tc>
+      </w:tr>
+      <w:tr>
+        <w:trPr>
+          <w:cantSplit/>
+        </w:trPr>
+        <w:tc>
+          <w:tcPr>
+            <w:tcW w:type="dxa" w:w="1100"/>
+            <w:shd w:val="clear" w:color="auto" w:fill="EEF3FA"/>
+            <w:tcMar>
+              <w:top w:w="80" w:type="dxa"/>
+              <w:bottom w:w="80" w:type="dxa"/>
+              <w:left w:w="100" w:type="dxa"/>
+              <w:right w:w="100" w:type="dxa"/>
+            </w:tcMar>
+          </w:tcPr>
+          <w:p>
+            <w:pPr>
+              <w:spacing w:after="0"/>
+            </w:pPr>
+            <w:r>
+              <w:rPr>
+                <w:rFonts w:ascii="Calibri" w:hAnsi="Calibri"/>
+                <w:b/>
+                <w:i w:val="0"/>
+                <w:sz w:val="19"/>
+              </w:rPr>
+              <w:t>49b7061</w:t>
+            </w:r>
+          </w:p>
+        </w:tc>
+        <w:tc>
+          <w:tcPr>
+            <w:tcW w:type="dxa" w:w="1900"/>
+            <w:shd w:val="clear" w:color="auto" w:fill="EEF3FA"/>
+            <w:tcMar>
+              <w:top w:w="80" w:type="dxa"/>
+              <w:bottom w:w="80" w:type="dxa"/>
+              <w:left w:w="100" w:type="dxa"/>
+              <w:right w:w="100" w:type="dxa"/>
+            </w:tcMar>
+          </w:tcPr>
+          <w:p>
+            <w:pPr>
+              <w:spacing w:after="0"/>
+            </w:pPr>
+            <w:r>
+              <w:rPr>
+                <w:rFonts w:ascii="Calibri" w:hAnsi="Calibri"/>
+                <w:b w:val="0"/>
+                <w:i w:val="0"/>
+                <w:sz w:val="19"/>
+              </w:rPr>
+              <w:t>15 Oct 2026 20:10</w:t>
+            </w:r>
+          </w:p>
+        </w:tc>
+        <w:tc>
+          <w:tcPr>
+            <w:tcW w:type="dxa" w:w="1700"/>
+            <w:shd w:val="clear" w:color="auto" w:fill="EEF3FA"/>
+            <w:tcMar>
+              <w:top w:w="80" w:type="dxa"/>
+              <w:bottom w:w="80" w:type="dxa"/>
+              <w:left w:w="100" w:type="dxa"/>
+              <w:right w:w="100" w:type="dxa"/>
+            </w:tcMar>
+          </w:tcPr>
+          <w:p>
+            <w:pPr>
+              <w:spacing w:after="0"/>
+            </w:pPr>
+            <w:r>
+              <w:rPr>
+                <w:rFonts w:ascii="Calibri" w:hAnsi="Calibri"/>
+                <w:b w:val="0"/>
+                <w:i w:val="0"/>
+                <w:sz w:val="19"/>
+              </w:rPr>
+              <w:t>KUSH AGHERA</w:t>
+            </w:r>
+          </w:p>
+        </w:tc>
+        <w:tc>
+          <w:tcPr>
+            <w:tcW w:type="dxa" w:w="2900"/>
+            <w:shd w:val="clear" w:color="auto" w:fill="EEF3FA"/>
+            <w:tcMar>
+              <w:top w:w="80" w:type="dxa"/>
+              <w:bottom w:w="80" w:type="dxa"/>
+              <w:left w:w="100" w:type="dxa"/>
+              <w:right w:w="100" w:type="dxa"/>
+            </w:tcMar>
+          </w:tcPr>
+          <w:p>
+            <w:pPr>
+              <w:spacing w:after="0"/>
+            </w:pPr>
+            <w:r>
+              <w:rPr>
+                <w:rFonts w:ascii="Calibri" w:hAnsi="Calibri"/>
+                <w:b w:val="0"/>
+                <w:i w:val="0"/>
+                <w:sz w:val="19"/>
+              </w:rPr>
+              <w:t>INITIALIZED</w:t>
+            </w:r>
+          </w:p>
+        </w:tc>
+        <w:tc>
+          <w:tcPr>
+            <w:tcW w:type="dxa" w:w="1760"/>
+            <w:shd w:val="clear" w:color="auto" w:fill="EEF3FA"/>
+            <w:tcMar>
+              <w:top w:w="80" w:type="dxa"/>
+              <w:bottom w:w="80" w:type="dxa"/>
+              <w:left w:w="100" w:type="dxa"/>
+              <w:right w:w="100" w:type="dxa"/>
+            </w:tcMar>
+          </w:tcPr>
+          <w:p>
+            <w:pPr>
+              <w:spacing w:after="0"/>
+            </w:pPr>
+            <w:r>
+              <w:rPr>
+                <w:rFonts w:ascii="Calibri" w:hAnsi="Calibri"/>
+                <w:b w:val="0"/>
+                <w:i w:val="0"/>
+                <w:sz w:val="19"/>
+              </w:rPr>
+              <w:t>1 file, +6 / −1 lines</w:t>
+            </w:r>
+          </w:p>
+        </w:tc>
+      </w:tr>
+      <w:tr>
+        <w:trPr>
+          <w:cantSplit/>
+        </w:trPr>
+        <w:tc>
+          <w:tcPr>
+            <w:tcW w:type="dxa" w:w="1100"/>
+            <w:shd w:val="clear" w:color="auto" w:fill="FFFFFF"/>
+            <w:tcMar>
+              <w:top w:w="80" w:type="dxa"/>
+              <w:bottom w:w="80" w:type="dxa"/>
+              <w:left w:w="100" w:type="dxa"/>
+              <w:right w:w="100" w:type="dxa"/>
+            </w:tcMar>
+          </w:tcPr>
+          <w:p>
+            <w:pPr>
+              <w:spacing w:after="0"/>
+            </w:pPr>
+            <w:r>
+              <w:rPr>
+                <w:rFonts w:ascii="Calibri" w:hAnsi="Calibri"/>
+                <w:b/>
+                <w:i w:val="0"/>
+                <w:sz w:val="19"/>
+              </w:rPr>
+              <w:t>eb8542b</w:t>
+            </w:r>
+          </w:p>
+        </w:tc>
+        <w:tc>
+          <w:tcPr>
+            <w:tcW w:type="dxa" w:w="1900"/>
+            <w:shd w:val="clear" w:color="auto" w:fill="FFFFFF"/>
+            <w:tcMar>
+              <w:top w:w="80" w:type="dxa"/>
+              <w:bottom w:w="80" w:type="dxa"/>
+              <w:left w:w="100" w:type="dxa"/>
+              <w:right w:w="100" w:type="dxa"/>
+            </w:tcMar>
+          </w:tcPr>
+          <w:p>
+            <w:pPr>
+              <w:spacing w:after="0"/>
+            </w:pPr>
+            <w:r>
+              <w:rPr>
+                <w:rFonts w:ascii="Calibri" w:hAnsi="Calibri"/>
+                <w:b w:val="0"/>
+                <w:i w:val="0"/>
+                <w:sz w:val="19"/>
+              </w:rPr>
+              <w:t>15 Oct 2026 21:13</w:t>
+            </w:r>
+          </w:p>
+        </w:tc>
+        <w:tc>
+          <w:tcPr>
+            <w:tcW w:type="dxa" w:w="1700"/>
+            <w:shd w:val="clear" w:color="auto" w:fill="FFFFFF"/>
+            <w:tcMar>
+              <w:top w:w="80" w:type="dxa"/>
+              <w:bottom w:w="80" w:type="dxa"/>
+              <w:left w:w="100" w:type="dxa"/>
+              <w:right w:w="100" w:type="dxa"/>
+            </w:tcMar>
+          </w:tcPr>
+          <w:p>
+            <w:pPr>
+              <w:spacing w:after="0"/>
+            </w:pPr>
+            <w:r>
+              <w:rPr>
+                <w:rFonts w:ascii="Calibri" w:hAnsi="Calibri"/>
+                <w:b w:val="0"/>
+                <w:i w:val="0"/>
+                <w:sz w:val="19"/>
+              </w:rPr>
+              <w:t>Kush Aghera</w:t>
+            </w:r>
+          </w:p>
+        </w:tc>
+        <w:tc>
+          <w:tcPr>
+            <w:tcW w:type="dxa" w:w="2900"/>
+            <w:shd w:val="clear" w:color="auto" w:fill="FFFFFF"/>
+            <w:tcMar>
+              <w:top w:w="80" w:type="dxa"/>
+              <w:bottom w:w="80" w:type="dxa"/>
+              <w:left w:w="100" w:type="dxa"/>
+              <w:right w:w="100" w:type="dxa"/>
+            </w:tcMar>
+          </w:tcPr>
+          <w:p>
+            <w:pPr>
+              <w:spacing w:after="0"/>
+            </w:pPr>
+            <w:r>
+              <w:rPr>
+                <w:rFonts w:ascii="Calibri" w:hAnsi="Calibri"/>
+                <w:b w:val="0"/>
+                <w:i w:val="0"/>
+                <w:sz w:val="19"/>
+              </w:rPr>
+              <w:t>init project base</w:t>
+            </w:r>
+          </w:p>
+        </w:tc>
+        <w:tc>
+          <w:tcPr>
+            <w:tcW w:type="dxa" w:w="1760"/>
+            <w:shd w:val="clear" w:color="auto" w:fill="FFFFFF"/>
+            <w:tcMar>
+              <w:top w:w="80" w:type="dxa"/>
+              <w:bottom w:w="80" w:type="dxa"/>
+              <w:left w:w="100" w:type="dxa"/>
+              <w:right w:w="100" w:type="dxa"/>
+            </w:tcMar>
+          </w:tcPr>
+          <w:p>
+            <w:pPr>
+              <w:spacing w:after="0"/>
+            </w:pPr>
+            <w:r>
+              <w:rPr>
+                <w:rFonts w:ascii="Calibri" w:hAnsi="Calibri"/>
+                <w:b w:val="0"/>
+                <w:i w:val="0"/>
+                <w:sz w:val="19"/>
+              </w:rPr>
+              <w:t>3 files, +81 / −0 lines</w:t>
+            </w:r>
+          </w:p>
+        </w:tc>
+      </w:tr>
+      <w:tr>
+        <w:trPr>
+          <w:cantSplit/>
+        </w:trPr>
+        <w:tc>
+          <w:tcPr>
+            <w:tcW w:type="dxa" w:w="1100"/>
+            <w:shd w:val="clear" w:color="auto" w:fill="EEF3FA"/>
+            <w:tcMar>
+              <w:top w:w="80" w:type="dxa"/>
+              <w:bottom w:w="80" w:type="dxa"/>
+              <w:left w:w="100" w:type="dxa"/>
+              <w:right w:w="100" w:type="dxa"/>
+            </w:tcMar>
+          </w:tcPr>
+          <w:p>
+            <w:pPr>
+              <w:spacing w:after="0"/>
+            </w:pPr>
+            <w:r>
+              <w:rPr>
+                <w:rFonts w:ascii="Calibri" w:hAnsi="Calibri"/>
+                <w:b/>
+                <w:i w:val="0"/>
+                <w:sz w:val="19"/>
+              </w:rPr>
+              <w:t>a2401f6</w:t>
+            </w:r>
+          </w:p>
+        </w:tc>
+        <w:tc>
+          <w:tcPr>
+            <w:tcW w:type="dxa" w:w="1900"/>
+            <w:shd w:val="clear" w:color="auto" w:fill="EEF3FA"/>
+            <w:tcMar>
+              <w:top w:w="80" w:type="dxa"/>
+              <w:bottom w:w="80" w:type="dxa"/>
+              <w:left w:w="100" w:type="dxa"/>
+              <w:right w:w="100" w:type="dxa"/>
+            </w:tcMar>
+          </w:tcPr>
+          <w:p>
+            <w:pPr>
+              <w:spacing w:after="0"/>
+            </w:pPr>
+            <w:r>
+              <w:rPr>
+                <w:rFonts w:ascii="Calibri" w:hAnsi="Calibri"/>
+                <w:b w:val="0"/>
+                <w:i w:val="0"/>
+                <w:sz w:val="19"/>
+              </w:rPr>
+              <w:t>15 Oct 2026 21:13</w:t>
+            </w:r>
+          </w:p>
+        </w:tc>
+        <w:tc>
+          <w:tcPr>
+            <w:tcW w:type="dxa" w:w="1700"/>
+            <w:shd w:val="clear" w:color="auto" w:fill="EEF3FA"/>
+            <w:tcMar>
+              <w:top w:w="80" w:type="dxa"/>
+              <w:bottom w:w="80" w:type="dxa"/>
+              <w:left w:w="100" w:type="dxa"/>
+              <w:right w:w="100" w:type="dxa"/>
+            </w:tcMar>
+          </w:tcPr>
+          <w:p>
+            <w:pPr>
+              <w:spacing w:after="0"/>
+            </w:pPr>
+            <w:r>
+              <w:rPr>
+                <w:rFonts w:ascii="Calibri" w:hAnsi="Calibri"/>
+                <w:b w:val="0"/>
+                <w:i w:val="0"/>
+                <w:sz w:val="19"/>
+              </w:rPr>
+              <w:t>Kush Aghera</w:t>
+            </w:r>
+          </w:p>
+        </w:tc>
+        <w:tc>
+          <w:tcPr>
+            <w:tcW w:type="dxa" w:w="2900"/>
+            <w:shd w:val="clear" w:color="auto" w:fill="EEF3FA"/>
+            <w:tcMar>
+              <w:top w:w="80" w:type="dxa"/>
+              <w:bottom w:w="80" w:type="dxa"/>
+              <w:left w:w="100" w:type="dxa"/>
+              <w:right w:w="100" w:type="dxa"/>
+            </w:tcMar>
+          </w:tcPr>
+          <w:p>
+            <w:pPr>
+              <w:spacing w:after="0"/>
+            </w:pPr>
+            <w:r>
+              <w:rPr>
+                <w:rFonts w:ascii="Calibri" w:hAnsi="Calibri"/>
+                <w:b w:val="0"/>
+                <w:i w:val="0"/>
+                <w:sz w:val="19"/>
+              </w:rPr>
+              <w:t>add agent core</w:t>
+            </w:r>
+          </w:p>
+        </w:tc>
+        <w:tc>
+          <w:tcPr>
+            <w:tcW w:type="dxa" w:w="1760"/>
+            <w:shd w:val="clear" w:color="auto" w:fill="EEF3FA"/>
+            <w:tcMar>
+              <w:top w:w="80" w:type="dxa"/>
+              <w:bottom w:w="80" w:type="dxa"/>
+              <w:left w:w="100" w:type="dxa"/>
+              <w:right w:w="100" w:type="dxa"/>
+            </w:tcMar>
+          </w:tcPr>
+          <w:p>
+            <w:pPr>
+              <w:spacing w:after="0"/>
+            </w:pPr>
+            <w:r>
+              <w:rPr>
+                <w:rFonts w:ascii="Calibri" w:hAnsi="Calibri"/>
+                <w:b w:val="0"/>
+                <w:i w:val="0"/>
+                <w:sz w:val="19"/>
+              </w:rPr>
+              <w:t>9 files, +1773 / −0 lines</w:t>
+            </w:r>
+          </w:p>
+        </w:tc>
+      </w:tr>
+      <w:tr>
+        <w:trPr>
+          <w:cantSplit/>
+        </w:trPr>
+        <w:tc>
+          <w:tcPr>
+            <w:tcW w:type="dxa" w:w="1100"/>
+            <w:shd w:val="clear" w:color="auto" w:fill="FFFFFF"/>
+            <w:tcMar>
+              <w:top w:w="80" w:type="dxa"/>
+              <w:bottom w:w="80" w:type="dxa"/>
+              <w:left w:w="100" w:type="dxa"/>
+              <w:right w:w="100" w:type="dxa"/>
+            </w:tcMar>
+          </w:tcPr>
+          <w:p>
+            <w:pPr>
+              <w:spacing w:after="0"/>
+            </w:pPr>
+            <w:r>
+              <w:rPr>
+                <w:rFonts w:ascii="Calibri" w:hAnsi="Calibri"/>
+                <w:b/>
+                <w:i w:val="0"/>
+                <w:sz w:val="19"/>
+              </w:rPr>
+              <w:t>d7cfe53</w:t>
+            </w:r>
+          </w:p>
+        </w:tc>
+        <w:tc>
+          <w:tcPr>
+            <w:tcW w:type="dxa" w:w="1900"/>
+            <w:shd w:val="clear" w:color="auto" w:fill="FFFFFF"/>
+            <w:tcMar>
+              <w:top w:w="80" w:type="dxa"/>
+              <w:bottom w:w="80" w:type="dxa"/>
+              <w:left w:w="100" w:type="dxa"/>
+              <w:right w:w="100" w:type="dxa"/>
+            </w:tcMar>
+          </w:tcPr>
+          <w:p>
+            <w:pPr>
+              <w:spacing w:after="0"/>
+            </w:pPr>
+            <w:r>
+              <w:rPr>
+                <w:rFonts w:ascii="Calibri" w:hAnsi="Calibri"/>
+                <w:b w:val="0"/>
+                <w:i w:val="0"/>
+                <w:sz w:val="19"/>
+              </w:rPr>
+              <w:t>15 Oct 2026 21:14</w:t>
+            </w:r>
+          </w:p>
+        </w:tc>
+        <w:tc>
+          <w:tcPr>
+            <w:tcW w:type="dxa" w:w="1700"/>
+            <w:shd w:val="clear" w:color="auto" w:fill="FFFFFF"/>
+            <w:tcMar>
+              <w:top w:w="80" w:type="dxa"/>
+              <w:bottom w:w="80" w:type="dxa"/>
+              <w:left w:w="100" w:type="dxa"/>
+              <w:right w:w="100" w:type="dxa"/>
+            </w:tcMar>
+          </w:tcPr>
+          <w:p>
+            <w:pPr>
+              <w:spacing w:after="0"/>
+            </w:pPr>
+            <w:r>
+              <w:rPr>
+                <w:rFonts w:ascii="Calibri" w:hAnsi="Calibri"/>
+                <w:b w:val="0"/>
+                <w:i w:val="0"/>
+                <w:sz w:val="19"/>
+              </w:rPr>
+              <w:t>Kush Aghera</w:t>
+            </w:r>
+          </w:p>
+        </w:tc>
+        <w:tc>
+          <w:tcPr>
+            <w:tcW w:type="dxa" w:w="2900"/>
+            <w:shd w:val="clear" w:color="auto" w:fill="FFFFFF"/>
+            <w:tcMar>
+              <w:top w:w="80" w:type="dxa"/>
+              <w:bottom w:w="80" w:type="dxa"/>
+              <w:left w:w="100" w:type="dxa"/>
+              <w:right w:w="100" w:type="dxa"/>
+            </w:tcMar>
+          </w:tcPr>
+          <w:p>
+            <w:pPr>
+              <w:spacing w:after="0"/>
+            </w:pPr>
+            <w:r>
+              <w:rPr>
+                <w:rFonts w:ascii="Calibri" w:hAnsi="Calibri"/>
+                <w:b w:val="0"/>
+                <w:i w:val="0"/>
+                <w:sz w:val="19"/>
+              </w:rPr>
+              <w:t>add test suite</w:t>
+            </w:r>
+          </w:p>
+        </w:tc>
+        <w:tc>
+          <w:tcPr>
+            <w:tcW w:type="dxa" w:w="1760"/>
+            <w:shd w:val="clear" w:color="auto" w:fill="FFFFFF"/>
+            <w:tcMar>
+              <w:top w:w="80" w:type="dxa"/>
+              <w:bottom w:w="80" w:type="dxa"/>
+              <w:left w:w="100" w:type="dxa"/>
+              <w:right w:w="100" w:type="dxa"/>
+            </w:tcMar>
+          </w:tcPr>
+          <w:p>
+            <w:pPr>
+              <w:spacing w:after="0"/>
+            </w:pPr>
+            <w:r>
+              <w:rPr>
+                <w:rFonts w:ascii="Calibri" w:hAnsi="Calibri"/>
+                <w:b w:val="0"/>
+                <w:i w:val="0"/>
+                <w:sz w:val="19"/>
+              </w:rPr>
+              <w:t>6 files, +398 / −0 lines</w:t>
+            </w:r>
+          </w:p>
+        </w:tc>
+      </w:tr>
+      <w:tr>
+        <w:trPr>
+          <w:cantSplit/>
+        </w:trPr>
+        <w:tc>
+          <w:tcPr>
+            <w:tcW w:type="dxa" w:w="1100"/>
+            <w:shd w:val="clear" w:color="auto" w:fill="EEF3FA"/>
+            <w:tcMar>
+              <w:top w:w="80" w:type="dxa"/>
+              <w:bottom w:w="80" w:type="dxa"/>
+              <w:left w:w="100" w:type="dxa"/>
+              <w:right w:w="100" w:type="dxa"/>
+            </w:tcMar>
+          </w:tcPr>
+          <w:p>
+            <w:pPr>
+              <w:spacing w:after="0"/>
+            </w:pPr>
+            <w:r>
+              <w:rPr>
+                <w:rFonts w:ascii="Calibri" w:hAnsi="Calibri"/>
+                <w:b/>
+                <w:i w:val="0"/>
+                <w:sz w:val="19"/>
+              </w:rPr>
+              <w:t>1912a9e</w:t>
+            </w:r>
+          </w:p>
+        </w:tc>
+        <w:tc>
+          <w:tcPr>
+            <w:tcW w:type="dxa" w:w="1900"/>
+            <w:shd w:val="clear" w:color="auto" w:fill="EEF3FA"/>
+            <w:tcMar>
+              <w:top w:w="80" w:type="dxa"/>
+              <w:bottom w:w="80" w:type="dxa"/>
+              <w:left w:w="100" w:type="dxa"/>
+              <w:right w:w="100" w:type="dxa"/>
+            </w:tcMar>
+          </w:tcPr>
+          <w:p>
+            <w:pPr>
+              <w:spacing w:after="0"/>
+            </w:pPr>
+            <w:r>
+              <w:rPr>
+                <w:rFonts w:ascii="Calibri" w:hAnsi="Calibri"/>
+                <w:b w:val="0"/>
+                <w:i w:val="0"/>
+                <w:sz w:val="19"/>
+              </w:rPr>
+              <w:t>15 Oct 2026 21:14</w:t>
+            </w:r>
+          </w:p>
+        </w:tc>
+        <w:tc>
+          <w:tcPr>
+            <w:tcW w:type="dxa" w:w="1700"/>
+            <w:shd w:val="clear" w:color="auto" w:fill="EEF3FA"/>
+            <w:tcMar>
+              <w:top w:w="80" w:type="dxa"/>
+              <w:bottom w:w="80" w:type="dxa"/>
+              <w:left w:w="100" w:type="dxa"/>
+              <w:right w:w="100" w:type="dxa"/>
+            </w:tcMar>
+          </w:tcPr>
+          <w:p>
+            <w:pPr>
+              <w:spacing w:after="0"/>
+            </w:pPr>
+            <w:r>
+              <w:rPr>
+                <w:rFonts w:ascii="Calibri" w:hAnsi="Calibri"/>
+                <w:b w:val="0"/>
+                <w:i w:val="0"/>
+                <w:sz w:val="19"/>
+              </w:rPr>
+              <w:t>Kush Aghera</w:t>
+            </w:r>
+          </w:p>
+        </w:tc>
+        <w:tc>
+          <w:tcPr>
+            <w:tcW w:type="dxa" w:w="2900"/>
+            <w:shd w:val="clear" w:color="auto" w:fill="EEF3FA"/>
+            <w:tcMar>
+              <w:top w:w="80" w:type="dxa"/>
+              <w:bottom w:w="80" w:type="dxa"/>
+              <w:left w:w="100" w:type="dxa"/>
+              <w:right w:w="100" w:type="dxa"/>
+            </w:tcMar>
+          </w:tcPr>
+          <w:p>
+            <w:pPr>
+              <w:spacing w:after="0"/>
+            </w:pPr>
+            <w:r>
+              <w:rPr>
+                <w:rFonts w:ascii="Calibri" w:hAnsi="Calibri"/>
+                <w:b w:val="0"/>
+                <w:i w:val="0"/>
+                <w:sz w:val="19"/>
+              </w:rPr>
+              <w:t>add documentation files</w:t>
+            </w:r>
+          </w:p>
+        </w:tc>
+        <w:tc>
+          <w:tcPr>
+            <w:tcW w:type="dxa" w:w="1760"/>
+            <w:shd w:val="clear" w:color="auto" w:fill="EEF3FA"/>
+            <w:tcMar>
+              <w:top w:w="80" w:type="dxa"/>
+              <w:bottom w:w="80" w:type="dxa"/>
+              <w:left w:w="100" w:type="dxa"/>
+              <w:right w:w="100" w:type="dxa"/>
+            </w:tcMar>
+          </w:tcPr>
+          <w:p>
+            <w:pPr>
+              <w:spacing w:after="0"/>
+            </w:pPr>
+            <w:r>
+              <w:rPr>
+                <w:rFonts w:ascii="Calibri" w:hAnsi="Calibri"/>
+                <w:b w:val="0"/>
+                <w:i w:val="0"/>
+                <w:sz w:val="19"/>
+              </w:rPr>
+              <w:t>4 files, +325 / −4 lines</w:t>
+            </w:r>
+          </w:p>
+        </w:tc>
+      </w:tr>
+      <w:tr>
+        <w:trPr>
+          <w:cantSplit/>
+        </w:trPr>
+        <w:tc>
+          <w:tcPr>
+            <w:tcW w:type="dxa" w:w="1100"/>
+            <w:shd w:val="clear" w:color="auto" w:fill="FFFFFF"/>
+            <w:tcMar>
+              <w:top w:w="80" w:type="dxa"/>
+              <w:bottom w:w="80" w:type="dxa"/>
+              <w:left w:w="100" w:type="dxa"/>
+              <w:right w:w="100" w:type="dxa"/>
+            </w:tcMar>
+          </w:tcPr>
+          <w:p>
+            <w:pPr>
+              <w:spacing w:after="0"/>
+            </w:pPr>
+            <w:r>
+              <w:rPr>
+                <w:rFonts w:ascii="Calibri" w:hAnsi="Calibri"/>
+                <w:b/>
+                <w:i w:val="0"/>
+                <w:sz w:val="19"/>
+              </w:rPr>
+              <w:t>759ba9c</w:t>
+            </w:r>
+          </w:p>
+        </w:tc>
+        <w:tc>
+          <w:tcPr>
+            <w:tcW w:type="dxa" w:w="1900"/>
+            <w:shd w:val="clear" w:color="auto" w:fill="FFFFFF"/>
+            <w:tcMar>
+              <w:top w:w="80" w:type="dxa"/>
+              <w:bottom w:w="80" w:type="dxa"/>
+              <w:left w:w="100" w:type="dxa"/>
+              <w:right w:w="100" w:type="dxa"/>
+            </w:tcMar>
+          </w:tcPr>
+          <w:p>
+            <w:pPr>
+              <w:spacing w:after="0"/>
+            </w:pPr>
+            <w:r>
+              <w:rPr>
+                <w:rFonts w:ascii="Calibri" w:hAnsi="Calibri"/>
+                <w:b w:val="0"/>
+                <w:i w:val="0"/>
+                <w:sz w:val="19"/>
+              </w:rPr>
+              <w:t>15 Oct 2026 21:40</w:t>
+            </w:r>
+          </w:p>
+        </w:tc>
+        <w:tc>
+          <w:tcPr>
+            <w:tcW w:type="dxa" w:w="1700"/>
+            <w:shd w:val="clear" w:color="auto" w:fill="FFFFFF"/>
+            <w:tcMar>
+              <w:top w:w="80" w:type="dxa"/>
+              <w:bottom w:w="80" w:type="dxa"/>
+              <w:left w:w="100" w:type="dxa"/>
+              <w:right w:w="100" w:type="dxa"/>
+            </w:tcMar>
+          </w:tcPr>
+          <w:p>
+            <w:pPr>
+              <w:spacing w:after="0"/>
+            </w:pPr>
+            <w:r>
+              <w:rPr>
+                <w:rFonts w:ascii="Calibri" w:hAnsi="Calibri"/>
+                <w:b w:val="0"/>
+                <w:i w:val="0"/>
+                <w:sz w:val="19"/>
+              </w:rPr>
+              <w:t>KUSH AGHERA</w:t>
+            </w:r>
+          </w:p>
+        </w:tc>
+        <w:tc>
+          <w:tcPr>
+            <w:tcW w:type="dxa" w:w="2900"/>
+            <w:shd w:val="clear" w:color="auto" w:fill="FFFFFF"/>
+            <w:tcMar>
+              <w:top w:w="80" w:type="dxa"/>
+              <w:bottom w:w="80" w:type="dxa"/>
+              <w:left w:w="100" w:type="dxa"/>
+              <w:right w:w="100" w:type="dxa"/>
+            </w:tcMar>
+          </w:tcPr>
+          <w:p>
+            <w:pPr>
+              <w:spacing w:after="0"/>
+            </w:pPr>
+            <w:r>
+              <w:rPr>
+                <w:rFonts w:ascii="Calibri" w:hAnsi="Calibri"/>
+                <w:b w:val="0"/>
+                <w:i w:val="0"/>
+                <w:sz w:val="19"/>
+              </w:rPr>
+              <w:t>started</w:t>
+            </w:r>
+          </w:p>
+        </w:tc>
+        <w:tc>
+          <w:tcPr>
+            <w:tcW w:type="dxa" w:w="1760"/>
+            <w:shd w:val="clear" w:color="auto" w:fill="FFFFFF"/>
+            <w:tcMar>
+              <w:top w:w="80" w:type="dxa"/>
+              <w:bottom w:w="80" w:type="dxa"/>
+              <w:left w:w="100" w:type="dxa"/>
+              <w:right w:w="100" w:type="dxa"/>
+            </w:tcMar>
+          </w:tcPr>
+          <w:p>
+            <w:pPr>
+              <w:spacing w:after="0"/>
+            </w:pPr>
+            <w:r>
+              <w:rPr>
+                <w:rFonts w:ascii="Calibri" w:hAnsi="Calibri"/>
+                <w:b w:val="0"/>
+                <w:i w:val="0"/>
+                <w:sz w:val="19"/>
+              </w:rPr>
+              <w:t>1 file, +1 / −1 lines</w:t>
+            </w:r>
+          </w:p>
+        </w:tc>
+      </w:tr>
+      <w:tr>
+        <w:trPr>
+          <w:cantSplit/>
+        </w:trPr>
+        <w:tc>
+          <w:tcPr>
+            <w:tcW w:type="dxa" w:w="1100"/>
+            <w:shd w:val="clear" w:color="auto" w:fill="EEF3FA"/>
+            <w:tcMar>
+              <w:top w:w="80" w:type="dxa"/>
+              <w:bottom w:w="80" w:type="dxa"/>
+              <w:left w:w="100" w:type="dxa"/>
+              <w:right w:w="100" w:type="dxa"/>
+            </w:tcMar>
+          </w:tcPr>
+          <w:p>
+            <w:pPr>
+              <w:spacing w:after="0"/>
+            </w:pPr>
+            <w:r>
+              <w:rPr>
+                <w:rFonts w:ascii="Calibri" w:hAnsi="Calibri"/>
+                <w:b/>
+                <w:i w:val="0"/>
+                <w:sz w:val="19"/>
+              </w:rPr>
+              <w:t>aca62bb</w:t>
+            </w:r>
+          </w:p>
+        </w:tc>
+        <w:tc>
+          <w:tcPr>
+            <w:tcW w:type="dxa" w:w="1900"/>
+            <w:shd w:val="clear" w:color="auto" w:fill="EEF3FA"/>
+            <w:tcMar>
+              <w:top w:w="80" w:type="dxa"/>
+              <w:bottom w:w="80" w:type="dxa"/>
+              <w:left w:w="100" w:type="dxa"/>
+              <w:right w:w="100" w:type="dxa"/>
+            </w:tcMar>
+          </w:tcPr>
+          <w:p>
+            <w:pPr>
+              <w:spacing w:after="0"/>
+            </w:pPr>
+            <w:r>
+              <w:rPr>
+                <w:rFonts w:ascii="Calibri" w:hAnsi="Calibri"/>
+                <w:b w:val="0"/>
+                <w:i w:val="0"/>
+                <w:sz w:val="19"/>
+              </w:rPr>
+              <w:t>15 Oct 2026 22:17</w:t>
+            </w:r>
+          </w:p>
+        </w:tc>
+        <w:tc>
+          <w:tcPr>
+            <w:tcW w:type="dxa" w:w="1700"/>
+            <w:shd w:val="clear" w:color="auto" w:fill="EEF3FA"/>
+            <w:tcMar>
+              <w:top w:w="80" w:type="dxa"/>
+              <w:bottom w:w="80" w:type="dxa"/>
+              <w:left w:w="100" w:type="dxa"/>
+              <w:right w:w="100" w:type="dxa"/>
+            </w:tcMar>
+          </w:tcPr>
+          <w:p>
+            <w:pPr>
+              <w:spacing w:after="0"/>
+            </w:pPr>
+            <w:r>
+              <w:rPr>
+                <w:rFonts w:ascii="Calibri" w:hAnsi="Calibri"/>
+                <w:b w:val="0"/>
+                <w:i w:val="0"/>
+                <w:sz w:val="19"/>
+              </w:rPr>
+              <w:t>Sandeep-More-1610</w:t>
+            </w:r>
+          </w:p>
+        </w:tc>
+        <w:tc>
+          <w:tcPr>
+            <w:tcW w:type="dxa" w:w="2900"/>
+            <w:shd w:val="clear" w:color="auto" w:fill="EEF3FA"/>
+            <w:tcMar>
+              <w:top w:w="80" w:type="dxa"/>
+              <w:bottom w:w="80" w:type="dxa"/>
+              <w:left w:w="100" w:type="dxa"/>
+              <w:right w:w="100" w:type="dxa"/>
+            </w:tcMar>
+          </w:tcPr>
+          <w:p>
+            <w:pPr>
+              <w:spacing w:after="0"/>
+            </w:pPr>
+            <w:r>
+              <w:rPr>
+                <w:rFonts w:ascii="Calibri" w:hAnsi="Calibri"/>
+                <w:b w:val="0"/>
+                <w:i w:val="0"/>
+                <w:sz w:val="19"/>
+              </w:rPr>
+              <w:t>Update member details for Sandeep More</w:t>
+            </w:r>
+          </w:p>
+        </w:tc>
+        <w:tc>
+          <w:tcPr>
+            <w:tcW w:type="dxa" w:w="1760"/>
+            <w:shd w:val="clear" w:color="auto" w:fill="EEF3FA"/>
+            <w:tcMar>
+              <w:top w:w="80" w:type="dxa"/>
+              <w:bottom w:w="80" w:type="dxa"/>
+              <w:left w:w="100" w:type="dxa"/>
+              <w:right w:w="100" w:type="dxa"/>
+            </w:tcMar>
+          </w:tcPr>
+          <w:p>
+            <w:pPr>
+              <w:spacing w:after="0"/>
+            </w:pPr>
+            <w:r>
+              <w:rPr>
+                <w:rFonts w:ascii="Calibri" w:hAnsi="Calibri"/>
+                <w:b w:val="0"/>
+                <w:i w:val="0"/>
+                <w:sz w:val="19"/>
+              </w:rPr>
+              <w:t>1 file, +1 / −1 lines</w:t>
+            </w:r>
+          </w:p>
+        </w:tc>
+      </w:tr>
+      <w:tr>
+        <w:trPr>
+          <w:cantSplit/>
+        </w:trPr>
+        <w:tc>
+          <w:tcPr>
+            <w:tcW w:type="dxa" w:w="1100"/>
+            <w:shd w:val="clear" w:color="auto" w:fill="FFFFFF"/>
+            <w:tcMar>
+              <w:top w:w="80" w:type="dxa"/>
+              <w:bottom w:w="80" w:type="dxa"/>
+              <w:left w:w="100" w:type="dxa"/>
+              <w:right w:w="100" w:type="dxa"/>
+            </w:tcMar>
+          </w:tcPr>
+          <w:p>
+            <w:pPr>
+              <w:spacing w:after="0"/>
+            </w:pPr>
+            <w:r>
+              <w:rPr>
+                <w:rFonts w:ascii="Calibri" w:hAnsi="Calibri"/>
+                <w:b/>
+                <w:i w:val="0"/>
+                <w:sz w:val="19"/>
+              </w:rPr>
+              <w:t>d15e083</w:t>
+            </w:r>
+          </w:p>
+        </w:tc>
+        <w:tc>
+          <w:tcPr>
+            <w:tcW w:type="dxa" w:w="1900"/>
+            <w:shd w:val="clear" w:color="auto" w:fill="FFFFFF"/>
+            <w:tcMar>
+              <w:top w:w="80" w:type="dxa"/>
+              <w:bottom w:w="80" w:type="dxa"/>
+              <w:left w:w="100" w:type="dxa"/>
+              <w:right w:w="100" w:type="dxa"/>
+            </w:tcMar>
+          </w:tcPr>
+          <w:p>
+            <w:pPr>
+              <w:spacing w:after="0"/>
+            </w:pPr>
+            <w:r>
+              <w:rPr>
+                <w:rFonts w:ascii="Calibri" w:hAnsi="Calibri"/>
+                <w:b w:val="0"/>
+                <w:i w:val="0"/>
+                <w:sz w:val="19"/>
+              </w:rPr>
+              <w:t>15 Oct 2026 22:21</w:t>
+            </w:r>
+          </w:p>
+        </w:tc>
+        <w:tc>
+          <w:tcPr>
+            <w:tcW w:type="dxa" w:w="1700"/>
+            <w:shd w:val="clear" w:color="auto" w:fill="FFFFFF"/>
+            <w:tcMar>
+              <w:top w:w="80" w:type="dxa"/>
+              <w:bottom w:w="80" w:type="dxa"/>
+              <w:left w:w="100" w:type="dxa"/>
+              <w:right w:w="100" w:type="dxa"/>
+            </w:tcMar>
+          </w:tcPr>
+          <w:p>
+            <w:pPr>
+              <w:spacing w:after="0"/>
+            </w:pPr>
+            <w:r>
+              <w:rPr>
+                <w:rFonts w:ascii="Calibri" w:hAnsi="Calibri"/>
+                <w:b w:val="0"/>
+                <w:i w:val="0"/>
+                <w:sz w:val="19"/>
+              </w:rPr>
+              <w:t>Kush Aghera</w:t>
+            </w:r>
+          </w:p>
+        </w:tc>
+        <w:tc>
+          <w:tcPr>
+            <w:tcW w:type="dxa" w:w="2900"/>
+            <w:shd w:val="clear" w:color="auto" w:fill="FFFFFF"/>
+            <w:tcMar>
+              <w:top w:w="80" w:type="dxa"/>
+              <w:bottom w:w="80" w:type="dxa"/>
+              <w:left w:w="100" w:type="dxa"/>
+              <w:right w:w="100" w:type="dxa"/>
+            </w:tcMar>
+          </w:tcPr>
+          <w:p>
+            <w:pPr>
+              <w:spacing w:after="0"/>
+            </w:pPr>
+            <w:r>
+              <w:rPr>
+                <w:rFonts w:ascii="Calibri" w:hAnsi="Calibri"/>
+                <w:b w:val="0"/>
+                <w:i w:val="0"/>
+                <w:sz w:val="19"/>
+              </w:rPr>
+              <w:t>add review docs</w:t>
+            </w:r>
+          </w:p>
+        </w:tc>
+        <w:tc>
+          <w:tcPr>
+            <w:tcW w:type="dxa" w:w="1760"/>
+            <w:shd w:val="clear" w:color="auto" w:fill="FFFFFF"/>
+            <w:tcMar>
+              <w:top w:w="80" w:type="dxa"/>
+              <w:bottom w:w="80" w:type="dxa"/>
+              <w:left w:w="100" w:type="dxa"/>
+              <w:right w:w="100" w:type="dxa"/>
+            </w:tcMar>
+          </w:tcPr>
+          <w:p>
+            <w:pPr>
+              <w:spacing w:after="0"/>
+            </w:pPr>
+            <w:r>
+              <w:rPr>
+                <w:rFonts w:ascii="Calibri" w:hAnsi="Calibri"/>
+                <w:b w:val="0"/>
+                <w:i w:val="0"/>
+                <w:sz w:val="19"/>
+              </w:rPr>
+              <w:t>2 files (binary: .docx / .pdf / .png)</w:t>
+            </w:r>
+          </w:p>
+        </w:tc>
+      </w:tr>
+      <w:tr>
+        <w:trPr>
+          <w:cantSplit/>
+        </w:trPr>
+        <w:tc>
+          <w:tcPr>
+            <w:tcW w:type="dxa" w:w="1100"/>
+            <w:shd w:val="clear" w:color="auto" w:fill="EEF3FA"/>
+            <w:tcMar>
+              <w:top w:w="80" w:type="dxa"/>
+              <w:bottom w:w="80" w:type="dxa"/>
+              <w:left w:w="100" w:type="dxa"/>
+              <w:right w:w="100" w:type="dxa"/>
+            </w:tcMar>
+          </w:tcPr>
+          <w:p>
+            <w:pPr>
+              <w:spacing w:after="0"/>
+            </w:pPr>
+            <w:r>
+              <w:rPr>
+                <w:rFonts w:ascii="Calibri" w:hAnsi="Calibri"/>
+                <w:b/>
+                <w:i w:val="0"/>
+                <w:sz w:val="19"/>
+              </w:rPr>
+              <w:t>2d64067</w:t>
+            </w:r>
+          </w:p>
+        </w:tc>
+        <w:tc>
+          <w:tcPr>
+            <w:tcW w:type="dxa" w:w="1900"/>
+            <w:shd w:val="clear" w:color="auto" w:fill="EEF3FA"/>
+            <w:tcMar>
+              <w:top w:w="80" w:type="dxa"/>
+              <w:bottom w:w="80" w:type="dxa"/>
+              <w:left w:w="100" w:type="dxa"/>
+              <w:right w:w="100" w:type="dxa"/>
+            </w:tcMar>
+          </w:tcPr>
+          <w:p>
+            <w:pPr>
+              <w:spacing w:after="0"/>
+            </w:pPr>
+            <w:r>
+              <w:rPr>
+                <w:rFonts w:ascii="Calibri" w:hAnsi="Calibri"/>
+                <w:b w:val="0"/>
+                <w:i w:val="0"/>
+                <w:sz w:val="19"/>
+              </w:rPr>
+              <w:t>15 Oct 2026 22:31</w:t>
+            </w:r>
+          </w:p>
+        </w:tc>
+        <w:tc>
+          <w:tcPr>
+            <w:tcW w:type="dxa" w:w="1700"/>
+            <w:shd w:val="clear" w:color="auto" w:fill="EEF3FA"/>
+            <w:tcMar>
+              <w:top w:w="80" w:type="dxa"/>
+              <w:bottom w:w="80" w:type="dxa"/>
+              <w:left w:w="100" w:type="dxa"/>
+              <w:right w:w="100" w:type="dxa"/>
+            </w:tcMar>
+          </w:tcPr>
+          <w:p>
+            <w:pPr>
+              <w:spacing w:after="0"/>
+            </w:pPr>
+            <w:r>
+              <w:rPr>
+                <w:rFonts w:ascii="Calibri" w:hAnsi="Calibri"/>
+                <w:b w:val="0"/>
+                <w:i w:val="0"/>
+                <w:sz w:val="19"/>
+              </w:rPr>
+              <w:t>Kush Aghera</w:t>
+            </w:r>
+          </w:p>
+        </w:tc>
+        <w:tc>
+          <w:tcPr>
+            <w:tcW w:type="dxa" w:w="2900"/>
+            <w:shd w:val="clear" w:color="auto" w:fill="EEF3FA"/>
+            <w:tcMar>
+              <w:top w:w="80" w:type="dxa"/>
+              <w:bottom w:w="80" w:type="dxa"/>
+              <w:left w:w="100" w:type="dxa"/>
+              <w:right w:w="100" w:type="dxa"/>
+            </w:tcMar>
+          </w:tcPr>
+          <w:p>
+            <w:pPr>
+              <w:spacing w:after="0"/>
+            </w:pPr>
+            <w:r>
+              <w:rPr>
+                <w:rFonts w:ascii="Calibri" w:hAnsi="Calibri"/>
+                <w:b w:val="0"/>
+                <w:i w:val="0"/>
+                <w:sz w:val="19"/>
+              </w:rPr>
+              <w:t>add review pdfs</w:t>
+            </w:r>
+          </w:p>
+        </w:tc>
+        <w:tc>
+          <w:tcPr>
+            <w:tcW w:type="dxa" w:w="1760"/>
+            <w:shd w:val="clear" w:color="auto" w:fill="EEF3FA"/>
+            <w:tcMar>
+              <w:top w:w="80" w:type="dxa"/>
+              <w:bottom w:w="80" w:type="dxa"/>
+              <w:left w:w="100" w:type="dxa"/>
+              <w:right w:w="100" w:type="dxa"/>
+            </w:tcMar>
+          </w:tcPr>
+          <w:p>
+            <w:pPr>
+              <w:spacing w:after="0"/>
+            </w:pPr>
+            <w:r>
+              <w:rPr>
+                <w:rFonts w:ascii="Calibri" w:hAnsi="Calibri"/>
+                <w:b w:val="0"/>
+                <w:i w:val="0"/>
+                <w:sz w:val="19"/>
+              </w:rPr>
+              <w:t>2 files (binary: .docx / .pdf / .png)</w:t>
+            </w:r>
+          </w:p>
+        </w:tc>
+      </w:tr>
+      <w:tr>
+        <w:trPr>
+          <w:cantSplit/>
+        </w:trPr>
+        <w:tc>
+          <w:tcPr>
+            <w:tcW w:type="dxa" w:w="1100"/>
+            <w:shd w:val="clear" w:color="auto" w:fill="FFFFFF"/>
+            <w:tcMar>
+              <w:top w:w="80" w:type="dxa"/>
+              <w:bottom w:w="80" w:type="dxa"/>
+              <w:left w:w="100" w:type="dxa"/>
+              <w:right w:w="100" w:type="dxa"/>
+            </w:tcMar>
+          </w:tcPr>
+          <w:p>
+            <w:pPr>
+              <w:spacing w:after="0"/>
+            </w:pPr>
+            <w:r>
+              <w:rPr>
+                <w:rFonts w:ascii="Calibri" w:hAnsi="Calibri"/>
+                <w:b/>
+                <w:i w:val="0"/>
+                <w:sz w:val="19"/>
+              </w:rPr>
+              <w:t>ff40930</w:t>
+            </w:r>
+          </w:p>
+        </w:tc>
+        <w:tc>
+          <w:tcPr>
+            <w:tcW w:type="dxa" w:w="1900"/>
+            <w:shd w:val="clear" w:color="auto" w:fill="FFFFFF"/>
+            <w:tcMar>
+              <w:top w:w="80" w:type="dxa"/>
+              <w:bottom w:w="80" w:type="dxa"/>
+              <w:left w:w="100" w:type="dxa"/>
+              <w:right w:w="100" w:type="dxa"/>
+            </w:tcMar>
+          </w:tcPr>
+          <w:p>
+            <w:pPr>
+              <w:spacing w:after="0"/>
+            </w:pPr>
+            <w:r>
+              <w:rPr>
+                <w:rFonts w:ascii="Calibri" w:hAnsi="Calibri"/>
+                <w:b w:val="0"/>
+                <w:i w:val="0"/>
+                <w:sz w:val="19"/>
+              </w:rPr>
+              <w:t>15 Oct 2026 22:44</w:t>
+            </w:r>
+          </w:p>
+        </w:tc>
+        <w:tc>
+          <w:tcPr>
+            <w:tcW w:type="dxa" w:w="1700"/>
+            <w:shd w:val="clear" w:color="auto" w:fill="FFFFFF"/>
+            <w:tcMar>
+              <w:top w:w="80" w:type="dxa"/>
+              <w:bottom w:w="80" w:type="dxa"/>
+              <w:left w:w="100" w:type="dxa"/>
+              <w:right w:w="100" w:type="dxa"/>
+            </w:tcMar>
+          </w:tcPr>
+          <w:p>
+            <w:pPr>
+              <w:spacing w:after="0"/>
+            </w:pPr>
+            <w:r>
+              <w:rPr>
+                <w:rFonts w:ascii="Calibri" w:hAnsi="Calibri"/>
+                <w:b w:val="0"/>
+                <w:i w:val="0"/>
+                <w:sz w:val="19"/>
+              </w:rPr>
+              <w:t>Kush Aghera</w:t>
+            </w:r>
+          </w:p>
+        </w:tc>
+        <w:tc>
+          <w:tcPr>
+            <w:tcW w:type="dxa" w:w="2900"/>
+            <w:shd w:val="clear" w:color="auto" w:fill="FFFFFF"/>
+            <w:tcMar>
+              <w:top w:w="80" w:type="dxa"/>
+              <w:bottom w:w="80" w:type="dxa"/>
+              <w:left w:w="100" w:type="dxa"/>
+              <w:right w:w="100" w:type="dxa"/>
+            </w:tcMar>
+          </w:tcPr>
+          <w:p>
+            <w:pPr>
+              <w:spacing w:after="0"/>
+            </w:pPr>
+            <w:r>
+              <w:rPr>
+                <w:rFonts w:ascii="Calibri" w:hAnsi="Calibri"/>
+                <w:b w:val="0"/>
+                <w:i w:val="0"/>
+                <w:sz w:val="19"/>
+              </w:rPr>
+              <w:t>add review three</w:t>
+            </w:r>
+          </w:p>
+        </w:tc>
+        <w:tc>
+          <w:tcPr>
+            <w:tcW w:type="dxa" w:w="1760"/>
+            <w:shd w:val="clear" w:color="auto" w:fill="FFFFFF"/>
+            <w:tcMar>
+              <w:top w:w="80" w:type="dxa"/>
+              <w:bottom w:w="80" w:type="dxa"/>
+              <w:left w:w="100" w:type="dxa"/>
+              <w:right w:w="100" w:type="dxa"/>
+            </w:tcMar>
+          </w:tcPr>
+          <w:p>
+            <w:pPr>
+              <w:spacing w:after="0"/>
+            </w:pPr>
+            <w:r>
+              <w:rPr>
+                <w:rFonts w:ascii="Calibri" w:hAnsi="Calibri"/>
+                <w:b w:val="0"/>
+                <w:i w:val="0"/>
+                <w:sz w:val="19"/>
+              </w:rPr>
+              <w:t>2 files (binary: .docx / .pdf / .png)</w:t>
+            </w:r>
+          </w:p>
+        </w:tc>
+      </w:tr>
+    </w:tbl>
+    <w:p>
+      <w:pPr>
+        <w:spacing w:after="80"/>
+      </w:pPr>
     </w:p>
     <w:sectPr>
       <w:pgSz w:w="12240" w:h="15840"/>

</xml_diff>

<commit_message>
Final review reports: combined Word document with GitHub structure section
- Reviews 1-3 rewritten in plain first-person wording, all text black
- Evidence appendices without commit tables
- Combined Reviews 1-3 as .docx and .pdf (no cover; GitHub link and
  project folder structure at the end; page numbers)
- README links the combined Word document

Co-Authored-By: Claude Opus 5.5 <noreply@anthropic.com>
</commit_message>
<xml_diff>
--- a/docs/Review_1_Smart_Archive_Agent.docx
+++ b/docs/Review_1_Smart_Archive_Agent.docx
@@ -11,7 +11,7 @@
         <w:rPr>
           <w:rFonts w:ascii="Calibri" w:hAnsi="Calibri"/>
           <w:b/>
-          <w:color w:val="1F497D"/>
+          <w:color w:val="000000"/>
           <w:sz w:val="44"/>
         </w:rPr>
         <w:t>REVIEW 1: PROJECT REPORT</w:t>
@@ -26,7 +26,7 @@
         <w:rPr>
           <w:rFonts w:ascii="Calibri" w:hAnsi="Calibri"/>
           <w:b/>
-          <w:color w:val="2E74B5"/>
+          <w:color w:val="000000"/>
           <w:sz w:val="26"/>
         </w:rPr>
         <w:t>Agentic Shell — Smart Archive Agent</w:t>
@@ -62,13 +62,14 @@
             <w:r>
               <w:rPr>
                 <w:b/>
-                <w:color w:val="1F497D"/>
+                <w:color w:val="000000"/>
                 <w:sz w:val="20"/>
               </w:rPr>
               <w:t xml:space="preserve">Course / Project: </w:t>
             </w:r>
             <w:r>
               <w:rPr>
+                <w:color w:val="000000"/>
                 <w:sz w:val="20"/>
               </w:rPr>
               <w:t>Operating Systems Project — Agentic Shell</w:t>
@@ -93,13 +94,14 @@
             <w:r>
               <w:rPr>
                 <w:b/>
-                <w:color w:val="1F497D"/>
+                <w:color w:val="000000"/>
                 <w:sz w:val="20"/>
               </w:rPr>
               <w:t xml:space="preserve">Project Title: </w:t>
             </w:r>
             <w:r>
               <w:rPr>
+                <w:color w:val="000000"/>
                 <w:sz w:val="20"/>
               </w:rPr>
               <w:t>Smart Archive Agent</w:t>
@@ -126,13 +128,14 @@
             <w:r>
               <w:rPr>
                 <w:b/>
-                <w:color w:val="1F497D"/>
+                <w:color w:val="000000"/>
                 <w:sz w:val="20"/>
               </w:rPr>
               <w:t xml:space="preserve">Team Details: </w:t>
             </w:r>
             <w:r>
               <w:rPr>
+                <w:color w:val="000000"/>
                 <w:sz w:val="20"/>
               </w:rPr>
               <w:t>Team 12</w:t>
@@ -157,13 +160,14 @@
             <w:r>
               <w:rPr>
                 <w:b/>
-                <w:color w:val="1F497D"/>
+                <w:color w:val="000000"/>
                 <w:sz w:val="20"/>
               </w:rPr>
               <w:t xml:space="preserve">Team Members: </w:t>
             </w:r>
             <w:r>
               <w:rPr>
+                <w:color w:val="000000"/>
                 <w:sz w:val="20"/>
               </w:rPr>
               <w:t>Kush Aghera (24BCE0149), Sandeep More (24BCE2883)</w:t>
@@ -186,7 +190,7 @@
         <w:rPr>
           <w:rFonts w:ascii="Calibri" w:hAnsi="Calibri"/>
           <w:b/>
-          <w:color w:val="1F497D"/>
+          <w:color w:val="000000"/>
           <w:sz w:val="32"/>
         </w:rPr>
         <w:t>Chapter 1: Introduction</w:t>
@@ -201,7 +205,7 @@
         <w:rPr>
           <w:rFonts w:ascii="Calibri" w:hAnsi="Calibri"/>
           <w:b/>
-          <w:color w:val="2E74B5"/>
+          <w:color w:val="000000"/>
           <w:sz w:val="26"/>
         </w:rPr>
         <w:t>1.1 Project Overview</w:t>
@@ -216,7 +220,7 @@
         <w:rPr>
           <w:rFonts w:ascii="Calibri" w:hAnsi="Calibri"/>
           <w:b/>
-          <w:color w:val="3C3C3C"/>
+          <w:color w:val="000000"/>
           <w:sz w:val="23"/>
         </w:rPr>
         <w:t>The evolution of Command Line Interfaces (CLIs)</w:t>
@@ -229,10 +233,11 @@
       <w:r>
         <w:rPr>
           <w:rFonts w:ascii="Calibri" w:hAnsi="Calibri"/>
-          <w:color w:val="3C3C3C"/>
+          <w:b w:val="0"/>
+          <w:color w:val="000000"/>
           <w:sz w:val="22"/>
         </w:rPr>
-        <w:t>Command Line Interfaces (CLIs) have served as the foundational pillar of computing and system administration since the dawn of modern operating systems, originating from early teleprinter terminals, the UNIX shell (sh), and modern POSIX environments such as Bash and Zsh. CLIs offer unmatched speed, deterministic scripting capabilities, and direct low-level control over kernel resources, processes, and storage subsystems. However, the operational power of traditional CLIs is tied to an explicit syntax model: users must memorize exact command names, nuanced flags, and order-dependent arguments.</w:t>
+        <w:t>Command-line interfaces have been the main way to control Unix and Linux systems since the first UNIX shell, and shells such as Bash and Zsh are still what most administrators use every day. They are fast, they can be scripted, and they give direct control over files, processes and storage. The catch is that the user has to remember the exact command, its flags and the order of its arguments.</w:t>
       </w:r>
     </w:p>
     <w:p>
@@ -244,7 +249,7 @@
         <w:rPr>
           <w:rFonts w:ascii="Calibri" w:hAnsi="Calibri"/>
           <w:b/>
-          <w:color w:val="3C3C3C"/>
+          <w:color w:val="000000"/>
           <w:sz w:val="23"/>
         </w:rPr>
         <w:t>The shift toward Natural Language Processing (NLP) in system administration</w:t>
@@ -257,10 +262,11 @@
       <w:r>
         <w:rPr>
           <w:rFonts w:ascii="Calibri" w:hAnsi="Calibri"/>
-          <w:color w:val="3C3C3C"/>
+          <w:b w:val="0"/>
+          <w:color w:val="000000"/>
           <w:sz w:val="22"/>
         </w:rPr>
-        <w:t>Recent advancements in Natural Language Processing (NLP) and Large Language Models (LLMs) have sparked a paradigm shift in human-computer interaction. Instead of burdening system operators and developers with memorizing complex argument vectors, modern system tooling is moving toward 'Agentic Shells'—intelligent agents capable of understanding high-level human intent and translating natural language into safe, verifiable system calls. Within this ecosystem, the Smart Archive Agent serves as a specialized, autonomous specialist dedicated to the storage and archiving domain, providing safe file packaging, compression, decompression, inspection, and cryptographic protection on Ubuntu Linux.</w:t>
+        <w:t>Large Language Models have changed what a terminal can look like. Instead of remembering flags, a user can describe what they want, and an agent turns that into real system operations. Our class is building one such "Agentic Shell": a base shell sends each request to one of 35 specialised agents. Our part is Agent #12, the Smart Archive Agent, which handles archiving, compression, extraction, inspection and encryption on Ubuntu Linux.</w:t>
       </w:r>
     </w:p>
     <w:p>
@@ -272,7 +278,7 @@
         <w:rPr>
           <w:rFonts w:ascii="Calibri" w:hAnsi="Calibri"/>
           <w:b/>
-          <w:color w:val="2E74B5"/>
+          <w:color w:val="000000"/>
           <w:sz w:val="26"/>
         </w:rPr>
         <w:t>1.2 Problem Statement</w:t>
@@ -287,7 +293,7 @@
         <w:rPr>
           <w:rFonts w:ascii="Calibri" w:hAnsi="Calibri"/>
           <w:b/>
-          <w:color w:val="3C3C3C"/>
+          <w:color w:val="000000"/>
           <w:sz w:val="23"/>
         </w:rPr>
         <w:t>Syntactical barriers and steep learning curves of traditional shells (Bash/PowerShell)</w:t>
@@ -300,10 +306,11 @@
       <w:r>
         <w:rPr>
           <w:rFonts w:ascii="Calibri" w:hAnsi="Calibri"/>
-          <w:color w:val="3C3C3C"/>
+          <w:b w:val="0"/>
+          <w:color w:val="000000"/>
           <w:sz w:val="22"/>
         </w:rPr>
-        <w:t>Traditional archiving and compression tools in Linux (e.g., tar, gzip, bzip2, xz, zip, and gpg) exhibit distinct, often inconsistent syntax conventions. For example, creating an xz-compressed tarball requires remembering 'tar -cJf archive.tar.xz folder', whereas gzip requires '-czf' and bzip2 requires '-cjf'. In contrast, file-level compression utilities like xz or gzip compress in-place and delete the original file unless explicit piping flags ('-c') are passed. Furthermore, symmetric encryption with GPG introduces additional parameters ('--symmetric', '--cipher-algo AES256'). Users who infrequently handle these tasks face significant friction and cognitive load.</w:t>
+        <w:t>Linux has several archive and compression tools (tar, gzip, bzip2, xz, zip and gpg), and each one has its own flags. An xz tarball needs tar -cJf, gzip needs -czf and bzip2 needs -cjf. xz and gzip delete the original file unless you remember -c, and encrypting with GPG adds --symmetric and --cipher-algo AES256. Unless you use these tools every day, you end up looking the flags up every time.</w:t>
       </w:r>
     </w:p>
     <w:p>
@@ -315,7 +322,7 @@
         <w:rPr>
           <w:rFonts w:ascii="Calibri" w:hAnsi="Calibri"/>
           <w:b/>
-          <w:color w:val="3C3C3C"/>
+          <w:color w:val="000000"/>
           <w:sz w:val="23"/>
         </w:rPr>
         <w:t>Risk of executing incorrect commands due to human error</w:t>
@@ -328,10 +335,11 @@
       <w:r>
         <w:rPr>
           <w:rFonts w:ascii="Calibri" w:hAnsi="Calibri"/>
-          <w:color w:val="3C3C3C"/>
+          <w:b w:val="0"/>
+          <w:color w:val="000000"/>
           <w:sz w:val="22"/>
         </w:rPr>
-        <w:t>Executing erroneous archive commands in shell environments carries acute operational risks. A common mistake is argument inversion (e.g., swapping source and destination paths in tar), which can silently overwrite a source file with an empty archive (demonstrated in Appendix A, Figure A.2). Similarly, unvetted extraction commands can trigger path traversal vulnerabilities (Zip Slip) or overwrite existing production files. The Smart Archive Agent addresses these risks by providing a safe translation layer that dispatches only into bounded, pre-validated functions with explicit path verification and strict non-overwrite rules.</w:t>
+        <w:t>Mistakes here can lose data. If the source and destination are swapped in a tar command, tar can overwrite the source file with an empty archive; we reproduced this ourselves (Appendix A, Figure A.2). Extracting an untrusted archive can also write files outside the target folder (the "Zip Slip" problem) or overwrite existing files. Our agent avoids this by only calling a fixed set of functions that check every path first and never overwrite anything.</w:t>
       </w:r>
     </w:p>
     <w:p>
@@ -343,7 +351,7 @@
         <w:rPr>
           <w:rFonts w:ascii="Calibri" w:hAnsi="Calibri"/>
           <w:b/>
-          <w:color w:val="2E74B5"/>
+          <w:color w:val="000000"/>
           <w:sz w:val="26"/>
         </w:rPr>
         <w:t>1.3 Objectives</w:t>
@@ -358,18 +366,19 @@
         <w:rPr>
           <w:rFonts w:ascii="Calibri" w:hAnsi="Calibri"/>
           <w:b/>
-          <w:color w:val="3C3C3C"/>
+          <w:color w:val="000000"/>
           <w:sz w:val="22"/>
         </w:rPr>
-        <w:t xml:space="preserve">Lightweight NL-to-CLI Translation: </w:t>
+        <w:t xml:space="preserve">Lightweight NL-to-CLI translation: </w:t>
       </w:r>
       <w:r>
         <w:rPr>
           <w:rFonts w:ascii="Calibri" w:hAnsi="Calibri"/>
-          <w:color w:val="3C3C3C"/>
+          <w:b w:val="0"/>
+          <w:color w:val="000000"/>
           <w:sz w:val="22"/>
         </w:rPr>
-        <w:t>To build a responsive, lightweight natural-language interpretation engine that parses natural language instructions into structured operations without requiring heavy third-party runtime dependencies.</w:t>
+        <w:t>turn plain-English requests into archive operations without heavy libraries or an internet connection.</w:t>
       </w:r>
     </w:p>
     <w:p>
@@ -381,18 +390,19 @@
         <w:rPr>
           <w:rFonts w:ascii="Calibri" w:hAnsi="Calibri"/>
           <w:b/>
-          <w:color w:val="3C3C3C"/>
+          <w:color w:val="000000"/>
           <w:sz w:val="22"/>
         </w:rPr>
-        <w:t xml:space="preserve">Predefined Operation Boundaries: </w:t>
+        <w:t xml:space="preserve">Predefined operation boundaries: </w:t>
       </w:r>
       <w:r>
         <w:rPr>
           <w:rFonts w:ascii="Calibri" w:hAnsi="Calibri"/>
-          <w:color w:val="3C3C3C"/>
+          <w:b w:val="0"/>
+          <w:color w:val="000000"/>
           <w:sz w:val="22"/>
         </w:rPr>
-        <w:t>To enforce safety by mapping requests strictly to predefined tool functions (create, extract, list, inspect, compress, decompress, encrypt, decrypt) rather than executing arbitrary shell command strings.</w:t>
+        <w:t>map every request to one of eight fixed tools (create, extract, list, inspect, compress, decompress, encrypt, decrypt) instead of running shell commands typed by the user.</w:t>
       </w:r>
     </w:p>
     <w:p>
@@ -404,18 +414,19 @@
         <w:rPr>
           <w:rFonts w:ascii="Calibri" w:hAnsi="Calibri"/>
           <w:b/>
-          <w:color w:val="3C3C3C"/>
+          <w:color w:val="000000"/>
           <w:sz w:val="22"/>
         </w:rPr>
-        <w:t xml:space="preserve">Model Context Protocol (MCP) Architectural Alignment: </w:t>
+        <w:t xml:space="preserve">MCP-style tool design: </w:t>
       </w:r>
       <w:r>
         <w:rPr>
           <w:rFonts w:ascii="Calibri" w:hAnsi="Calibri"/>
-          <w:color w:val="3C3C3C"/>
+          <w:b w:val="0"/>
+          <w:color w:val="000000"/>
           <w:sz w:val="22"/>
         </w:rPr>
-        <w:t>To design tool definitions, input schemas, and execution workflows in alignment with the Model Context Protocol (MCP) standards, allowing seamless future integration with broader agent networks.</w:t>
+        <w:t>describe each tool with a name, a description and a JSON Schema, the way the Model Context Protocol describes tools, so the class shell's LLM can call our agent.</w:t>
       </w:r>
     </w:p>
     <w:p>
@@ -427,18 +438,19 @@
         <w:rPr>
           <w:rFonts w:ascii="Calibri" w:hAnsi="Calibri"/>
           <w:b/>
-          <w:color w:val="3C3C3C"/>
+          <w:color w:val="000000"/>
           <w:sz w:val="22"/>
         </w:rPr>
-        <w:t xml:space="preserve">Security &amp; Guardrail Integration: </w:t>
+        <w:t xml:space="preserve">Security and guardrails: </w:t>
       </w:r>
       <w:r>
         <w:rPr>
           <w:rFonts w:ascii="Calibri" w:hAnsi="Calibri"/>
-          <w:color w:val="3C3C3C"/>
+          <w:b w:val="0"/>
+          <w:color w:val="000000"/>
           <w:sz w:val="22"/>
         </w:rPr>
-        <w:t>To implement robust path validation, prevent Zip Slip directory traversal attacks, prevent accidental file overwrites, and provide AES-256 GPG encryption for sensitive files.</w:t>
+        <w:t>check every path, block Zip Slip, never overwrite files, and provide AES-256 GPG encryption for sensitive files.</w:t>
       </w:r>
     </w:p>
     <w:p>
@@ -450,18 +462,19 @@
         <w:rPr>
           <w:rFonts w:ascii="Calibri" w:hAnsi="Calibri"/>
           <w:b/>
-          <w:color w:val="3C3C3C"/>
+          <w:color w:val="000000"/>
           <w:sz w:val="22"/>
         </w:rPr>
-        <w:t xml:space="preserve">Structured Feedback: </w:t>
+        <w:t xml:space="preserve">Structured feedback: </w:t>
       </w:r>
       <w:r>
         <w:rPr>
           <w:rFonts w:ascii="Calibri" w:hAnsi="Calibri"/>
-          <w:color w:val="3C3C3C"/>
+          <w:b w:val="0"/>
+          <w:color w:val="000000"/>
           <w:sz w:val="22"/>
         </w:rPr>
-        <w:t>To return actionable success messages, output artifacts, entry listings, and descriptive error diagnostics directly to the user.</w:t>
+        <w:t>always return a clear result: what was created, what is inside an archive, or what went wrong.</w:t>
       </w:r>
     </w:p>
     <w:p>
@@ -473,7 +486,7 @@
         <w:rPr>
           <w:rFonts w:ascii="Calibri" w:hAnsi="Calibri"/>
           <w:b/>
-          <w:color w:val="2E74B5"/>
+          <w:color w:val="000000"/>
           <w:sz w:val="26"/>
         </w:rPr>
         <w:t>1.4 Scope and Limitations</w:t>
@@ -488,18 +501,19 @@
         <w:rPr>
           <w:rFonts w:ascii="Calibri" w:hAnsi="Calibri"/>
           <w:b/>
-          <w:color w:val="3C3C3C"/>
+          <w:color w:val="000000"/>
           <w:sz w:val="22"/>
         </w:rPr>
-        <w:t xml:space="preserve">Supported Operating Systems: </w:t>
+        <w:t xml:space="preserve">Supported operating systems: </w:t>
       </w:r>
       <w:r>
         <w:rPr>
           <w:rFonts w:ascii="Calibri" w:hAnsi="Calibri"/>
-          <w:color w:val="3C3C3C"/>
+          <w:b w:val="0"/>
+          <w:color w:val="000000"/>
           <w:sz w:val="22"/>
         </w:rPr>
-        <w:t>The Smart Archive Agent is natively targeted for Ubuntu Linux and Windows Subsystem for Linux (WSL 2). It uses standard Linux binaries (tar, gzip, bzip2, xz, file, gpg) and Python (written for 3.8 or newer, tested on 3.14); zip archives are handled by Python's built-in zipfile module.</w:t>
+        <w:t>Ubuntu Linux, including Ubuntu under WSL 2 on Windows, which is what we develop on. The agent uses the standard tools tar, gzip, bzip2, xz, file and gpg, and Python (written for 3.8 or newer, tested on 3.14); zip files are handled by Python's built-in zipfile module.</w:t>
       </w:r>
     </w:p>
     <w:p>
@@ -511,18 +525,19 @@
         <w:rPr>
           <w:rFonts w:ascii="Calibri" w:hAnsi="Calibri"/>
           <w:b/>
-          <w:color w:val="3C3C3C"/>
+          <w:color w:val="000000"/>
           <w:sz w:val="22"/>
         </w:rPr>
-        <w:t xml:space="preserve">Terminal Environments: </w:t>
+        <w:t xml:space="preserve">Terminal environments: </w:t>
       </w:r>
       <w:r>
         <w:rPr>
           <w:rFonts w:ascii="Calibri" w:hAnsi="Calibri"/>
-          <w:color w:val="3C3C3C"/>
+          <w:b w:val="0"/>
+          <w:color w:val="000000"/>
           <w:sz w:val="22"/>
         </w:rPr>
-        <w:t>Operates within standard terminal shells (Bash, Zsh) as an interactive REPL or direct CLI command tool.</w:t>
+        <w:t>it runs in a normal terminal (Bash or Zsh), either as an interactive prompt or as a one-line command.</w:t>
       </w:r>
     </w:p>
     <w:p>
@@ -534,18 +549,19 @@
         <w:rPr>
           <w:rFonts w:ascii="Calibri" w:hAnsi="Calibri"/>
           <w:b/>
-          <w:color w:val="3C3C3C"/>
+          <w:color w:val="000000"/>
           <w:sz w:val="22"/>
         </w:rPr>
-        <w:t xml:space="preserve">Administrative Privileges: </w:t>
+        <w:t xml:space="preserve">Administrative privileges: </w:t>
       </w:r>
       <w:r>
         <w:rPr>
           <w:rFonts w:ascii="Calibri" w:hAnsi="Calibri"/>
-          <w:color w:val="3C3C3C"/>
+          <w:b w:val="0"/>
+          <w:color w:val="000000"/>
           <w:sz w:val="22"/>
         </w:rPr>
-        <w:t>The agent runs strictly with ordinary user privileges. It explicitly avoids requiring 'sudo' or root escalation, eliminating the possibility of root-level filesystem damage.</w:t>
+        <w:t>it runs as a normal user and never asks for sudo, so it cannot damage system files.</w:t>
       </w:r>
     </w:p>
     <w:p>
@@ -557,18 +573,19 @@
         <w:rPr>
           <w:rFonts w:ascii="Calibri" w:hAnsi="Calibri"/>
           <w:b/>
-          <w:color w:val="3C3C3C"/>
+          <w:color w:val="000000"/>
           <w:sz w:val="22"/>
         </w:rPr>
-        <w:t xml:space="preserve">Domain Boundaries: </w:t>
+        <w:t xml:space="preserve">Domain boundaries: </w:t>
       </w:r>
       <w:r>
         <w:rPr>
           <w:rFonts w:ascii="Calibri" w:hAnsi="Calibri"/>
-          <w:color w:val="3C3C3C"/>
+          <w:b w:val="0"/>
+          <w:color w:val="000000"/>
           <w:sz w:val="22"/>
         </w:rPr>
-        <w:t>The agent is strictly bounded to file packaging, compression, and encryption. Unrelated queries (e.g., process management, network configuration, general Q&amp;A) are identified and safely rejected.</w:t>
+        <w:t>it only handles archiving, compression and encryption. Anything else, such as process management or network settings, is rejected so that the shell can send it to the right agent.</w:t>
       </w:r>
     </w:p>
     <w:p>
@@ -580,7 +597,7 @@
         <w:rPr>
           <w:rFonts w:ascii="Calibri" w:hAnsi="Calibri"/>
           <w:b/>
-          <w:color w:val="1F497D"/>
+          <w:color w:val="000000"/>
           <w:sz w:val="32"/>
         </w:rPr>
         <w:t>Chapter 2: Literature Review &amp; Theoretical Background</w:t>
@@ -595,7 +612,7 @@
         <w:rPr>
           <w:rFonts w:ascii="Calibri" w:hAnsi="Calibri"/>
           <w:b/>
-          <w:color w:val="2E74B5"/>
+          <w:color w:val="000000"/>
           <w:sz w:val="26"/>
         </w:rPr>
         <w:t>2.1 Large Language Models (LLMs) in Code Generation</w:t>
@@ -610,7 +627,7 @@
         <w:rPr>
           <w:rFonts w:ascii="Calibri" w:hAnsi="Calibri"/>
           <w:b/>
-          <w:color w:val="3C3C3C"/>
+          <w:color w:val="000000"/>
           <w:sz w:val="23"/>
         </w:rPr>
         <w:t>Capabilities of modern LLMs in structured text and code synthesis</w:t>
@@ -623,10 +640,11 @@
       <w:r>
         <w:rPr>
           <w:rFonts w:ascii="Calibri" w:hAnsi="Calibri"/>
-          <w:color w:val="3C3C3C"/>
+          <w:b w:val="0"/>
+          <w:color w:val="000000"/>
           <w:sz w:val="22"/>
         </w:rPr>
-        <w:t>Current frontier model families (such as OpenAI GPT, Anthropic Claude and Google Gemini) have demonstrated remarkable capabilities in translating unstructured natural language into structured outputs, API payloads, and executable code. Function calling and structured tool outputs enable language models to extract entities from natural text and populate predefined JSON schemas with high fidelity. In system administration, this capability enables flexible intent detection across diverse phrasings and languages.</w:t>
+        <w:t>Current LLM families such as OpenAI GPT, Anthropic Claude and Google Gemini are good at turning plain sentences into structured output. With function calling, a model fills in a predefined JSON schema instead of writing free text, which is exactly what an agent needs to pick a tool and its arguments.</w:t>
       </w:r>
     </w:p>
     <w:p>
@@ -638,7 +656,7 @@
         <w:rPr>
           <w:rFonts w:ascii="Calibri" w:hAnsi="Calibri"/>
           <w:b/>
-          <w:color w:val="3C3C3C"/>
+          <w:color w:val="000000"/>
           <w:sz w:val="23"/>
         </w:rPr>
         <w:t>Challenges with LLM hallucination in system-level execution</w:t>
@@ -651,10 +669,11 @@
       <w:r>
         <w:rPr>
           <w:rFonts w:ascii="Calibri" w:hAnsi="Calibri"/>
-          <w:color w:val="3C3C3C"/>
+          <w:b w:val="0"/>
+          <w:color w:val="000000"/>
           <w:sz w:val="22"/>
         </w:rPr>
-        <w:t>Despite their linguistic proficiency, LLMs suffer from probabilistic hallucinations—generating non-existent file paths, fabricating invalid command-line flags, or selecting destructive operations. In operating systems, executing an unvetted LLM-generated shell command directly in 'sh' or 'bash' is fundamentally insecure. To mitigate this hazard, our project adopts a strict 'Separation of Concerns': intent interpretation is kept separate from execution. The agent utilizes an intent router with schema-enforced tool calls, ensuring that every argument is verified by deterministic validation guards before reaching the OS.</w:t>
+        <w:t>The problem is that LLMs can hallucinate: they may invent file paths, make up flags or pick a destructive command. Running a model's output directly in bash is therefore unsafe. That is why we kept understanding the request separate from running it: whatever produces the tool call, every argument is checked by our own validation code before anything touches the system.</w:t>
       </w:r>
     </w:p>
     <w:p>
@@ -666,7 +685,7 @@
         <w:rPr>
           <w:rFonts w:ascii="Calibri" w:hAnsi="Calibri"/>
           <w:b/>
-          <w:color w:val="2E74B5"/>
+          <w:color w:val="000000"/>
           <w:sz w:val="26"/>
         </w:rPr>
         <w:t>2.2 Introduction to Model Context Protocol (MCP)</w:t>
@@ -681,7 +700,7 @@
         <w:rPr>
           <w:rFonts w:ascii="Calibri" w:hAnsi="Calibri"/>
           <w:b/>
-          <w:color w:val="3C3C3C"/>
+          <w:color w:val="000000"/>
           <w:sz w:val="23"/>
         </w:rPr>
         <w:t>Architecture of MCP (Clients, Servers, and Tools)</w:t>
@@ -694,10 +713,11 @@
       <w:r>
         <w:rPr>
           <w:rFonts w:ascii="Calibri" w:hAnsi="Calibri"/>
-          <w:color w:val="3C3C3C"/>
+          <w:b w:val="0"/>
+          <w:color w:val="000000"/>
           <w:sz w:val="22"/>
         </w:rPr>
-        <w:t>The Model Context Protocol (MCP), open-sourced by Anthropic, is an open standard designed to connect AI applications with external tools, data sources, and execution environments. The MCP architecture comprises three key entities: (1) MCP Clients (the host application or agent orchestrator), (2) MCP Servers (lightweight programs exposing specialized capabilities), and (3) MCP Tools (individual functions declared with JSON Schema parameter specifications). MCP establishes clean contracts for discovery, input validation, and execution.</w:t>
+        <w:t>The Model Context Protocol (MCP), published by Anthropic, is an open standard for connecting AI applications to tools and data. It has three parts: clients (the application that uses tools), servers (programs that offer tools) and tools (single functions, each described with a JSON Schema for its inputs).</w:t>
       </w:r>
     </w:p>
     <w:p>
@@ -709,7 +729,7 @@
         <w:rPr>
           <w:rFonts w:ascii="Calibri" w:hAnsi="Calibri"/>
           <w:b/>
-          <w:color w:val="3C3C3C"/>
+          <w:color w:val="000000"/>
           <w:sz w:val="23"/>
         </w:rPr>
         <w:t>Why MCP is preferred over traditional rigid API tooling for local system access</w:t>
@@ -722,10 +742,11 @@
       <w:r>
         <w:rPr>
           <w:rFonts w:ascii="Calibri" w:hAnsi="Calibri"/>
-          <w:color w:val="3C3C3C"/>
+          <w:b w:val="0"/>
+          <w:color w:val="000000"/>
           <w:sz w:val="22"/>
         </w:rPr>
-        <w:t>Traditional system scripting interfaces rely either on brittle text-based CLI parsing or bespoke, proprietary RPC adapters. MCP provides standardized discovery, dynamic capability negotiation, and uniform error reporting. By adopting MCP-aligned tool interfaces, the Smart Archive Agent can run as a standalone terminal specialist today and seamlessly plug into an enterprise-wide multi-agent shell tomorrow without altering its core archiving and security implementations.</w:t>
+        <w:t>Before MCP, connecting a model to local tools usually meant reading command output as plain text or writing a custom adapter for every tool. MCP gives one standard way to discover tools, check their inputs and report errors. Because we describe our tools in the same way, our agent works on its own today and can be plugged into the class-wide shell without changing its archive and security code.</w:t>
       </w:r>
     </w:p>
     <w:p>
@@ -737,7 +758,7 @@
         <w:rPr>
           <w:rFonts w:ascii="Calibri" w:hAnsi="Calibri"/>
           <w:b/>
-          <w:color w:val="2E74B5"/>
+          <w:color w:val="000000"/>
           <w:sz w:val="26"/>
         </w:rPr>
         <w:t>2.3 Existing Solutions</w:t>
@@ -750,10 +771,11 @@
       <w:r>
         <w:rPr>
           <w:rFonts w:ascii="Calibri" w:hAnsi="Calibri"/>
-          <w:color w:val="3C3C3C"/>
+          <w:b w:val="0"/>
+          <w:color w:val="000000"/>
           <w:sz w:val="22"/>
         </w:rPr>
-        <w:t>A comparative study of current commercial and open-source terminal assistance solutions reveals distinct architectural philosophies:</w:t>
+        <w:t>We compared our approach with the terminal assistants that already exist:</w:t>
       </w:r>
     </w:p>
     <w:tbl>
@@ -785,10 +807,10 @@
             <w:r>
               <w:rPr>
                 <w:b/>
-                <w:color w:val="FFFFFF"/>
+                <w:color w:val="000000"/>
                 <w:sz w:val="19"/>
               </w:rPr>
-              <w:t>Solution</w:t>
+              <w:t>Tool</w:t>
             </w:r>
           </w:p>
         </w:tc>
@@ -807,10 +829,10 @@
             <w:r>
               <w:rPr>
                 <w:b/>
-                <w:color w:val="FFFFFF"/>
+                <w:color w:val="000000"/>
                 <w:sz w:val="19"/>
               </w:rPr>
-              <w:t>Primary Paradigm</w:t>
+              <w:t>How it works</w:t>
             </w:r>
           </w:p>
         </w:tc>
@@ -829,10 +851,10 @@
             <w:r>
               <w:rPr>
                 <w:b/>
-                <w:color w:val="FFFFFF"/>
+                <w:color w:val="000000"/>
                 <w:sz w:val="19"/>
               </w:rPr>
-              <w:t>Security / Sandboxing</w:t>
+              <w:t>Safety</w:t>
             </w:r>
           </w:p>
         </w:tc>
@@ -851,10 +873,10 @@
             <w:r>
               <w:rPr>
                 <w:b/>
-                <w:color w:val="FFFFFF"/>
+                <w:color w:val="000000"/>
                 <w:sz w:val="19"/>
               </w:rPr>
-              <w:t>Relevance to this Project</w:t>
+              <w:t>What it means for our project</w:t>
             </w:r>
           </w:p>
         </w:tc>
@@ -874,10 +896,10 @@
           <w:p>
             <w:r>
               <w:rPr>
-                <w:color w:val="3C3C3C"/>
+                <w:color w:val="000000"/>
                 <w:sz w:val="18"/>
               </w:rPr>
-              <w:t>Traditional Bash</w:t>
+              <w:t>Plain Bash</w:t>
             </w:r>
           </w:p>
         </w:tc>
@@ -895,10 +917,10 @@
           <w:p>
             <w:r>
               <w:rPr>
-                <w:color w:val="3C3C3C"/>
+                <w:color w:val="000000"/>
                 <w:sz w:val="18"/>
               </w:rPr>
-              <w:t>Manual command-line execution</w:t>
+              <w:t>The user types every command by hand</w:t>
             </w:r>
           </w:p>
         </w:tc>
@@ -916,10 +938,10 @@
           <w:p>
             <w:r>
               <w:rPr>
-                <w:color w:val="3C3C3C"/>
+                <w:color w:val="000000"/>
                 <w:sz w:val="18"/>
               </w:rPr>
-              <w:t>User permissions only; no syntax safety or guardrails.</w:t>
+              <w:t>Only normal user permissions; nothing checks the syntax</w:t>
             </w:r>
           </w:p>
         </w:tc>
@@ -937,10 +959,10 @@
           <w:p>
             <w:r>
               <w:rPr>
-                <w:color w:val="3C3C3C"/>
+                <w:color w:val="000000"/>
                 <w:sz w:val="18"/>
               </w:rPr>
-              <w:t>Reliable system backends, but requires exhaustive syntax memorization.</w:t>
+              <w:t>The tools themselves are reliable, but you must remember every flag</w:t>
             </w:r>
           </w:p>
         </w:tc>
@@ -960,7 +982,7 @@
           <w:p>
             <w:r>
               <w:rPr>
-                <w:color w:val="3C3C3C"/>
+                <w:color w:val="000000"/>
                 <w:sz w:val="18"/>
               </w:rPr>
               <w:t>Warp AI</w:t>
@@ -981,10 +1003,10 @@
           <w:p>
             <w:r>
               <w:rPr>
-                <w:color w:val="3C3C3C"/>
+                <w:color w:val="000000"/>
                 <w:sz w:val="18"/>
               </w:rPr>
-              <w:t>AI-assisted terminal emulator</w:t>
+              <w:t>Terminal with AI command suggestions</w:t>
             </w:r>
           </w:p>
         </w:tc>
@@ -1002,10 +1024,10 @@
           <w:p>
             <w:r>
               <w:rPr>
-                <w:color w:val="3C3C3C"/>
+                <w:color w:val="000000"/>
                 <w:sz w:val="18"/>
               </w:rPr>
-              <w:t>Suggests shell commands; user must review before executing in terminal.</w:t>
+              <w:t>Suggests shell commands; the user has to review them before running</w:t>
             </w:r>
           </w:p>
         </w:tc>
@@ -1023,10 +1045,10 @@
           <w:p>
             <w:r>
               <w:rPr>
-                <w:color w:val="3C3C3C"/>
+                <w:color w:val="000000"/>
                 <w:sz w:val="18"/>
               </w:rPr>
-              <w:t>Demonstrates natural-language interaction in terminals, but executes arbitrary shell scripts.</w:t>
+              <w:t>Shows that plain-English terminals work, but it still runs whatever shell script it suggests</w:t>
             </w:r>
           </w:p>
         </w:tc>
@@ -1046,7 +1068,7 @@
           <w:p>
             <w:r>
               <w:rPr>
-                <w:color w:val="3C3C3C"/>
+                <w:color w:val="000000"/>
                 <w:sz w:val="18"/>
               </w:rPr>
               <w:t>GitHub Copilot CLI</w:t>
@@ -1067,10 +1089,10 @@
           <w:p>
             <w:r>
               <w:rPr>
-                <w:color w:val="3C3C3C"/>
+                <w:color w:val="000000"/>
                 <w:sz w:val="18"/>
               </w:rPr>
-              <w:t>NL-to-shell command synthesizer</w:t>
+              <w:t>Turns a sentence into a shell command</w:t>
             </w:r>
           </w:p>
         </w:tc>
@@ -1088,10 +1110,10 @@
           <w:p>
             <w:r>
               <w:rPr>
-                <w:color w:val="3C3C3C"/>
+                <w:color w:val="000000"/>
                 <w:sz w:val="18"/>
               </w:rPr>
-              <w:t>Explains generated bash command; requires manual user confirmation.</w:t>
+              <w:t>Explains the command and asks the user to confirm</w:t>
             </w:r>
           </w:p>
         </w:tc>
@@ -1109,10 +1131,10 @@
           <w:p>
             <w:r>
               <w:rPr>
-                <w:color w:val="3C3C3C"/>
+                <w:color w:val="000000"/>
                 <w:sz w:val="18"/>
               </w:rPr>
-              <w:t>Illustrates LLM-driven command generation; vulnerable to flag hallucinations.</w:t>
+              <w:t>Shows LLM command generation, but the model can still make up flags</w:t>
             </w:r>
           </w:p>
         </w:tc>
@@ -1132,10 +1154,10 @@
           <w:p>
             <w:r>
               <w:rPr>
-                <w:color w:val="3C3C3C"/>
+                <w:color w:val="000000"/>
                 <w:sz w:val="18"/>
               </w:rPr>
-              <w:t>Smart Archive Agent (Ours)</w:t>
+              <w:t>Smart Archive Agent (ours)</w:t>
             </w:r>
           </w:p>
         </w:tc>
@@ -1153,10 +1175,10 @@
           <w:p>
             <w:r>
               <w:rPr>
-                <w:color w:val="3C3C3C"/>
+                <w:color w:val="000000"/>
                 <w:sz w:val="18"/>
               </w:rPr>
-              <w:t>Domain-bounded Agentic Specialist</w:t>
+              <w:t>One agent focused only on archives</w:t>
             </w:r>
           </w:p>
         </w:tc>
@@ -1174,10 +1196,10 @@
           <w:p>
             <w:r>
               <w:rPr>
-                <w:color w:val="3C3C3C"/>
+                <w:color w:val="000000"/>
                 <w:sz w:val="18"/>
               </w:rPr>
-              <w:t>Strict function dispatch; path validation; Zip-Slip prevention; non-root execution.</w:t>
+              <w:t>Fixed tools only; every path checked; Zip Slip blocked; never uses root</w:t>
             </w:r>
           </w:p>
         </w:tc>
@@ -1195,10 +1217,10 @@
           <w:p>
             <w:r>
               <w:rPr>
-                <w:color w:val="3C3C3C"/>
+                <w:color w:val="000000"/>
                 <w:sz w:val="18"/>
               </w:rPr>
-              <w:t>Combines natural language ease with deterministic guardrails in a specialized storage domain.</w:t>
+              <w:t>Plain-English requests, but every action goes through our own checks</w:t>
             </w:r>
           </w:p>
         </w:tc>
@@ -1213,7 +1235,7 @@
         <w:rPr>
           <w:rFonts w:ascii="Calibri" w:hAnsi="Calibri"/>
           <w:b/>
-          <w:color w:val="1F497D"/>
+          <w:color w:val="000000"/>
           <w:sz w:val="32"/>
         </w:rPr>
         <w:t>References</w:t>
@@ -1226,7 +1248,7 @@
       <w:r>
         <w:rPr>
           <w:rFonts w:ascii="Calibri" w:hAnsi="Calibri"/>
-          <w:color w:val="3C3C3C"/>
+          <w:color w:val="000000"/>
           <w:sz w:val="22"/>
         </w:rPr>
         <w:t>[1] Anthropic, 'Model Context Protocol (MCP) Specification,' 2024. [Online]. Available: https://modelcontextprotocol.io/</w:t>
@@ -1239,7 +1261,7 @@
       <w:r>
         <w:rPr>
           <w:rFonts w:ascii="Calibri" w:hAnsi="Calibri"/>
-          <w:color w:val="3C3C3C"/>
+          <w:color w:val="000000"/>
           <w:sz w:val="22"/>
         </w:rPr>
         <w:t>[2] OpenAI, 'Function Calling and Structured Outputs Guide,' 2024. [Online]. Available: https://platform.openai.com/docs/guides/function-calling</w:t>
@@ -1252,7 +1274,7 @@
       <w:r>
         <w:rPr>
           <w:rFonts w:ascii="Calibri" w:hAnsi="Calibri"/>
-          <w:color w:val="3C3C3C"/>
+          <w:color w:val="000000"/>
           <w:sz w:val="22"/>
         </w:rPr>
         <w:t>[3] Free Software Foundation, 'GNU Tar Manual: Tape Archiving Utility,' GNU Project, 2023. [Online]. Available: https://www.gnu.org/software/tar/manual/</w:t>
@@ -1265,7 +1287,7 @@
       <w:r>
         <w:rPr>
           <w:rFonts w:ascii="Calibri" w:hAnsi="Calibri"/>
-          <w:color w:val="3C3C3C"/>
+          <w:color w:val="000000"/>
           <w:sz w:val="22"/>
         </w:rPr>
         <w:t>[4] Warp Technologies, 'Warp: The AI-Powered Terminal User Guide,' 2024. [Online]. Available: https://docs.warp.dev/</w:t>
@@ -1278,7 +1300,7 @@
       <w:r>
         <w:rPr>
           <w:rFonts w:ascii="Calibri" w:hAnsi="Calibri"/>
-          <w:color w:val="3C3C3C"/>
+          <w:color w:val="000000"/>
           <w:sz w:val="22"/>
         </w:rPr>
         <w:t>[5] GitHub Inc., 'GitHub Copilot in the CLI Documentation,' 2024. [Online]. Available: https://docs.github.com/en/copilot/using-github-copilot-in-the-cli</w:t>
@@ -1295,6 +1317,7 @@
           <w:rFonts w:ascii="Calibri" w:hAnsi="Calibri"/>
           <w:b/>
           <w:i w:val="0"/>
+          <w:color w:val="000000"/>
           <w:sz w:val="32"/>
         </w:rPr>
         <w:t>Appendix A: Evidence of Work — Review 1 Stage</w:t>
@@ -1309,9 +1332,10 @@
           <w:rFonts w:ascii="Calibri" w:hAnsi="Calibri"/>
           <w:b w:val="0"/>
           <w:i w:val="0"/>
+          <w:color w:val="000000"/>
           <w:sz w:val="22"/>
         </w:rPr>
-        <w:t>This appendix records evidence from the first stage of the project (problem analysis, environment set-up and the first version of the code). All terminal output is captured from our development machine; the repository is public at https://github.com/redrighthand2007/OS-SMART-ARCHIVE-AGENT, so every commit listed can be inspected.</w:t>
+        <w:t>This appendix shows what we did in the first stage of the project: setting up our environment and checking the problem for ourselves before writing the code. Everything below is real output from our machine, and the full source code is public on GitHub (see "GitHub Repository and Project Structure" at the end of this document).</w:t>
       </w:r>
     </w:p>
     <w:p>
@@ -1324,9 +1348,10 @@
           <w:rFonts w:ascii="Calibri" w:hAnsi="Calibri"/>
           <w:b/>
           <w:i w:val="0"/>
+          <w:color w:val="000000"/>
           <w:sz w:val="26"/>
         </w:rPr>
-        <w:t>A.1 Development Environment</w:t>
+        <w:t>A.1 Our Development Environment</w:t>
       </w:r>
     </w:p>
     <w:p>
@@ -1338,9 +1363,10 @@
           <w:rFonts w:ascii="Calibri" w:hAnsi="Calibri"/>
           <w:b w:val="0"/>
           <w:i w:val="0"/>
+          <w:color w:val="000000"/>
           <w:sz w:val="22"/>
         </w:rPr>
-        <w:t>The project was developed and tested on Ubuntu inside Windows Subsystem for Linux 2, using the standard archive and encryption utilities that ship with Ubuntu.</w:t>
+        <w:t>We develop on Ubuntu running inside WSL 2 on Windows, using the archive and encryption tools that come with Ubuntu. These are the versions we used:</w:t>
       </w:r>
     </w:p>
     <w:p>
@@ -1350,6 +1376,9 @@
         <w:jc w:val="center"/>
       </w:pPr>
       <w:r>
+        <w:rPr>
+          <w:color w:val="000000"/>
+        </w:rPr>
         <w:drawing>
           <wp:inline xmlns:a="http://schemas.openxmlformats.org/drawingml/2006/main" xmlns:pic="http://schemas.openxmlformats.org/drawingml/2006/picture">
             <wp:extent cx="5943600" cy="1978918"/>
@@ -1394,9 +1423,10 @@
           <w:rFonts w:ascii="Calibri" w:hAnsi="Calibri"/>
           <w:b/>
           <w:i w:val="0"/>
+          <w:color w:val="000000"/>
           <w:sz w:val="20"/>
         </w:rPr>
-        <w:t>Figure A.1: Operating system, kernel, Python and utility versions on the development machine.</w:t>
+        <w:t>Figure A.1: Operating system, kernel, Python and tool versions on our development machine.</w:t>
       </w:r>
     </w:p>
     <w:p>
@@ -1409,9 +1439,10 @@
           <w:rFonts w:ascii="Calibri" w:hAnsi="Calibri"/>
           <w:b/>
           <w:i w:val="0"/>
+          <w:color w:val="000000"/>
           <w:sz w:val="26"/>
         </w:rPr>
-        <w:t>A.2 The Problem Demonstrated with the Raw Linux Tools</w:t>
+        <w:t>A.2 Checking the Problem with the Raw Linux Tools</w:t>
       </w:r>
     </w:p>
     <w:p>
@@ -1423,9 +1454,10 @@
           <w:rFonts w:ascii="Calibri" w:hAnsi="Calibri"/>
           <w:b w:val="0"/>
           <w:i w:val="0"/>
+          <w:color w:val="000000"/>
           <w:sz w:val="22"/>
         </w:rPr>
-        <w:t>To confirm the problem statement in Section 1.2, we reproduced the two most common mistakes with the standard tools in a scratch folder:</w:t>
+        <w:t>Before writing any code, we wanted to see the problem from Section 1.2 for ourselves, so we tried the common mistakes in a test folder:</w:t>
       </w:r>
     </w:p>
     <w:p>
@@ -1438,18 +1470,20 @@
           <w:rFonts w:ascii="Calibri" w:hAnsi="Calibri"/>
           <w:b/>
           <w:i w:val="0"/>
+          <w:color w:val="000000"/>
           <w:sz w:val="22"/>
         </w:rPr>
-        <w:t>Swapped tar arguments destroy data:</w:t>
+        <w:t>Swapping tar's arguments loses data:</w:t>
       </w:r>
       <w:r>
         <w:rPr>
           <w:rFonts w:ascii="Calibri" w:hAnsi="Calibri"/>
           <w:b w:val="0"/>
           <w:i w:val="0"/>
+          <w:color w:val="000000"/>
           <w:sz w:val="22"/>
         </w:rPr>
-        <w:t xml:space="preserve"> report.txt contained text; after tar -cJf report.txt backup.tar.xz (source and destination swapped), tar reported an error, but report.txt had already been replaced by an empty xz archive, so the original text is lost.</w:t>
+        <w:t xml:space="preserve"> report.txt held some text. We ran tar -cJf report.txt backup.tar.xz, with the source and destination the wrong way round. tar printed an error, but by then it had already replaced report.txt with an empty xz archive, so the text was gone.</w:t>
       </w:r>
     </w:p>
     <w:p>
@@ -1462,6 +1496,7 @@
           <w:rFonts w:ascii="Calibri" w:hAnsi="Calibri"/>
           <w:b/>
           <w:i w:val="0"/>
+          <w:color w:val="000000"/>
           <w:sz w:val="22"/>
         </w:rPr>
         <w:t>xz removes the original:</w:t>
@@ -1471,9 +1506,10 @@
           <w:rFonts w:ascii="Calibri" w:hAnsi="Calibri"/>
           <w:b w:val="0"/>
           <w:i w:val="0"/>
+          <w:color w:val="000000"/>
           <w:sz w:val="22"/>
         </w:rPr>
-        <w:t xml:space="preserve"> xz notes.txt leaves only notes.txt.xz.</w:t>
+        <w:t xml:space="preserve"> after xz notes.txt, only notes.txt.xz is left.</w:t>
       </w:r>
     </w:p>
     <w:p>
@@ -1486,18 +1522,20 @@
           <w:rFonts w:ascii="Calibri" w:hAnsi="Calibri"/>
           <w:b/>
           <w:i w:val="0"/>
+          <w:color w:val="000000"/>
           <w:sz w:val="22"/>
         </w:rPr>
-        <w:t>The correct manual chain is long:</w:t>
+        <w:t>The correct manual steps are long:</w:t>
       </w:r>
       <w:r>
         <w:rPr>
           <w:rFonts w:ascii="Calibri" w:hAnsi="Calibri"/>
           <w:b w:val="0"/>
           <w:i w:val="0"/>
+          <w:color w:val="000000"/>
           <w:sz w:val="22"/>
         </w:rPr>
-        <w:t xml:space="preserve"> the brief's request (archive heavily, then encrypt, then remove the plaintext) needs three commands and eight flags (XZ_OPT=-9e, -cJf, --batch, --pinentry-mode, --passphrase, --symmetric, --cipher-algo AES256, rm), which the Smart Archive Agent replaces with one sentence.</w:t>
+        <w:t xml:space="preserve"> doing the brief's task by hand (archive heavily, encrypt, delete the plaintext) took us three commands and eight flags (XZ_OPT=-9e, -cJf, --batch, --pinentry-mode, --passphrase, --symmetric, --cipher-algo AES256, rm). With our agent it is one sentence.</w:t>
       </w:r>
     </w:p>
     <w:p>
@@ -1507,6 +1545,9 @@
         <w:jc w:val="center"/>
       </w:pPr>
       <w:r>
+        <w:rPr>
+          <w:color w:val="000000"/>
+        </w:rPr>
         <w:drawing>
           <wp:inline xmlns:a="http://schemas.openxmlformats.org/drawingml/2006/main" xmlns:pic="http://schemas.openxmlformats.org/drawingml/2006/picture">
             <wp:extent cx="5943600" cy="2560952"/>
@@ -1551,1714 +1592,11 @@
           <w:rFonts w:ascii="Calibri" w:hAnsi="Calibri"/>
           <w:b/>
           <w:i w:val="0"/>
+          <w:color w:val="000000"/>
           <w:sz w:val="20"/>
         </w:rPr>
-        <w:t>Figure A.2: Real data loss from swapped tar arguments, xz deleting its input, and the manual command chain for the brief's request.</w:t>
+        <w:t>Figure A.2: Data lost by swapped tar arguments, xz deleting its input, and the manual commands needed for the brief's task.</w:t>
       </w:r>
-    </w:p>
-    <w:p>
-      <w:pPr>
-        <w:keepNext/>
-        <w:spacing w:after="120" w:before="200"/>
-      </w:pPr>
-      <w:r>
-        <w:rPr>
-          <w:rFonts w:ascii="Calibri" w:hAnsi="Calibri"/>
-          <w:b/>
-          <w:i w:val="0"/>
-          <w:sz w:val="26"/>
-        </w:rPr>
-        <w:t>A.3 Project Repository and Commit History (Stage 1)</w:t>
-      </w:r>
-    </w:p>
-    <w:p>
-      <w:pPr>
-        <w:spacing w:after="120"/>
-      </w:pPr>
-      <w:r>
-        <w:rPr>
-          <w:rFonts w:ascii="Calibri" w:hAnsi="Calibri"/>
-          <w:b w:val="0"/>
-          <w:i w:val="0"/>
-          <w:sz w:val="22"/>
-        </w:rPr>
-        <w:t>The repository was created on 15 October 2026. The first day's commits set up the project base, the first agent core, the first test suite and the documentation, with commits from both team members:</w:t>
-      </w:r>
-    </w:p>
-    <w:p>
-      <w:pPr>
-        <w:keepNext/>
-        <w:spacing w:after="80"/>
-        <w:jc w:val="center"/>
-      </w:pPr>
-      <w:r>
-        <w:rPr>
-          <w:rFonts w:ascii="Calibri" w:hAnsi="Calibri"/>
-          <w:b/>
-          <w:i w:val="0"/>
-          <w:sz w:val="20"/>
-        </w:rPr>
-        <w:t>Table A.1: Commits of 15 October 2026 (from git log on the public repository).</w:t>
-      </w:r>
-    </w:p>
-    <w:tbl>
-      <w:tblPr>
-        <w:tblW w:type="auto" w:w="0"/>
-        <w:tblLook w:firstColumn="1" w:firstRow="1" w:lastColumn="0" w:lastRow="0" w:noHBand="0" w:noVBand="1" w:val="04A0"/>
-        <w:jc w:val="center"/>
-        <w:tblLayout w:type="fixed"/>
-        <w:tblBorders>
-          <w:top w:val="single" w:sz="4" w:space="0" w:color="BFBFBF"/>
-          <w:left w:val="single" w:sz="4" w:space="0" w:color="BFBFBF"/>
-          <w:bottom w:val="single" w:sz="4" w:space="0" w:color="BFBFBF"/>
-          <w:right w:val="single" w:sz="4" w:space="0" w:color="BFBFBF"/>
-          <w:insideH w:val="single" w:sz="4" w:space="0" w:color="BFBFBF"/>
-          <w:insideV w:val="single" w:sz="4" w:space="0" w:color="BFBFBF"/>
-        </w:tblBorders>
-      </w:tblPr>
-      <w:tblGrid>
-        <w:gridCol w:w="1100"/>
-        <w:gridCol w:w="1900"/>
-        <w:gridCol w:w="1700"/>
-        <w:gridCol w:w="2900"/>
-        <w:gridCol w:w="1760"/>
-      </w:tblGrid>
-      <w:tr>
-        <w:trPr>
-          <w:tblHeader/>
-          <w:cantSplit/>
-        </w:trPr>
-        <w:tc>
-          <w:tcPr>
-            <w:tcW w:type="dxa" w:w="1100"/>
-            <w:shd w:val="clear" w:color="auto" w:fill="1F497D"/>
-            <w:tcMar>
-              <w:top w:w="80" w:type="dxa"/>
-              <w:bottom w:w="80" w:type="dxa"/>
-              <w:left w:w="100" w:type="dxa"/>
-              <w:right w:w="100" w:type="dxa"/>
-            </w:tcMar>
-          </w:tcPr>
-          <w:p>
-            <w:pPr>
-              <w:keepNext/>
-              <w:spacing w:after="0"/>
-            </w:pPr>
-            <w:r>
-              <w:rPr>
-                <w:rFonts w:ascii="Calibri" w:hAnsi="Calibri"/>
-                <w:b/>
-                <w:i w:val="0"/>
-                <w:color w:val="FFFFFF"/>
-                <w:sz w:val="19"/>
-              </w:rPr>
-              <w:t>Commit</w:t>
-            </w:r>
-          </w:p>
-        </w:tc>
-        <w:tc>
-          <w:tcPr>
-            <w:tcW w:type="dxa" w:w="1900"/>
-            <w:shd w:val="clear" w:color="auto" w:fill="1F497D"/>
-            <w:tcMar>
-              <w:top w:w="80" w:type="dxa"/>
-              <w:bottom w:w="80" w:type="dxa"/>
-              <w:left w:w="100" w:type="dxa"/>
-              <w:right w:w="100" w:type="dxa"/>
-            </w:tcMar>
-          </w:tcPr>
-          <w:p>
-            <w:pPr>
-              <w:keepNext/>
-              <w:spacing w:after="0"/>
-            </w:pPr>
-            <w:r>
-              <w:rPr>
-                <w:rFonts w:ascii="Calibri" w:hAnsi="Calibri"/>
-                <w:b/>
-                <w:i w:val="0"/>
-                <w:color w:val="FFFFFF"/>
-                <w:sz w:val="19"/>
-              </w:rPr>
-              <w:t>Date and time</w:t>
-            </w:r>
-          </w:p>
-        </w:tc>
-        <w:tc>
-          <w:tcPr>
-            <w:tcW w:type="dxa" w:w="1700"/>
-            <w:shd w:val="clear" w:color="auto" w:fill="1F497D"/>
-            <w:tcMar>
-              <w:top w:w="80" w:type="dxa"/>
-              <w:bottom w:w="80" w:type="dxa"/>
-              <w:left w:w="100" w:type="dxa"/>
-              <w:right w:w="100" w:type="dxa"/>
-            </w:tcMar>
-          </w:tcPr>
-          <w:p>
-            <w:pPr>
-              <w:keepNext/>
-              <w:spacing w:after="0"/>
-            </w:pPr>
-            <w:r>
-              <w:rPr>
-                <w:rFonts w:ascii="Calibri" w:hAnsi="Calibri"/>
-                <w:b/>
-                <w:i w:val="0"/>
-                <w:color w:val="FFFFFF"/>
-                <w:sz w:val="19"/>
-              </w:rPr>
-              <w:t>Author</w:t>
-            </w:r>
-          </w:p>
-        </w:tc>
-        <w:tc>
-          <w:tcPr>
-            <w:tcW w:type="dxa" w:w="2900"/>
-            <w:shd w:val="clear" w:color="auto" w:fill="1F497D"/>
-            <w:tcMar>
-              <w:top w:w="80" w:type="dxa"/>
-              <w:bottom w:w="80" w:type="dxa"/>
-              <w:left w:w="100" w:type="dxa"/>
-              <w:right w:w="100" w:type="dxa"/>
-            </w:tcMar>
-          </w:tcPr>
-          <w:p>
-            <w:pPr>
-              <w:keepNext/>
-              <w:spacing w:after="0"/>
-            </w:pPr>
-            <w:r>
-              <w:rPr>
-                <w:rFonts w:ascii="Calibri" w:hAnsi="Calibri"/>
-                <w:b/>
-                <w:i w:val="0"/>
-                <w:color w:val="FFFFFF"/>
-                <w:sz w:val="19"/>
-              </w:rPr>
-              <w:t>Change</w:t>
-            </w:r>
-          </w:p>
-        </w:tc>
-        <w:tc>
-          <w:tcPr>
-            <w:tcW w:type="dxa" w:w="1760"/>
-            <w:shd w:val="clear" w:color="auto" w:fill="1F497D"/>
-            <w:tcMar>
-              <w:top w:w="80" w:type="dxa"/>
-              <w:bottom w:w="80" w:type="dxa"/>
-              <w:left w:w="100" w:type="dxa"/>
-              <w:right w:w="100" w:type="dxa"/>
-            </w:tcMar>
-          </w:tcPr>
-          <w:p>
-            <w:pPr>
-              <w:keepNext/>
-              <w:spacing w:after="0"/>
-            </w:pPr>
-            <w:r>
-              <w:rPr>
-                <w:rFonts w:ascii="Calibri" w:hAnsi="Calibri"/>
-                <w:b/>
-                <w:i w:val="0"/>
-                <w:color w:val="FFFFFF"/>
-                <w:sz w:val="19"/>
-              </w:rPr>
-              <w:t>Size</w:t>
-            </w:r>
-          </w:p>
-        </w:tc>
-      </w:tr>
-      <w:tr>
-        <w:trPr>
-          <w:cantSplit/>
-        </w:trPr>
-        <w:tc>
-          <w:tcPr>
-            <w:tcW w:type="dxa" w:w="1100"/>
-            <w:shd w:val="clear" w:color="auto" w:fill="FFFFFF"/>
-            <w:tcMar>
-              <w:top w:w="80" w:type="dxa"/>
-              <w:bottom w:w="80" w:type="dxa"/>
-              <w:left w:w="100" w:type="dxa"/>
-              <w:right w:w="100" w:type="dxa"/>
-            </w:tcMar>
-          </w:tcPr>
-          <w:p>
-            <w:pPr>
-              <w:spacing w:after="0"/>
-            </w:pPr>
-            <w:r>
-              <w:rPr>
-                <w:rFonts w:ascii="Calibri" w:hAnsi="Calibri"/>
-                <w:b/>
-                <w:i w:val="0"/>
-                <w:sz w:val="19"/>
-              </w:rPr>
-              <w:t>e1f4d65</w:t>
-            </w:r>
-          </w:p>
-        </w:tc>
-        <w:tc>
-          <w:tcPr>
-            <w:tcW w:type="dxa" w:w="1900"/>
-            <w:shd w:val="clear" w:color="auto" w:fill="FFFFFF"/>
-            <w:tcMar>
-              <w:top w:w="80" w:type="dxa"/>
-              <w:bottom w:w="80" w:type="dxa"/>
-              <w:left w:w="100" w:type="dxa"/>
-              <w:right w:w="100" w:type="dxa"/>
-            </w:tcMar>
-          </w:tcPr>
-          <w:p>
-            <w:pPr>
-              <w:spacing w:after="0"/>
-            </w:pPr>
-            <w:r>
-              <w:rPr>
-                <w:rFonts w:ascii="Calibri" w:hAnsi="Calibri"/>
-                <w:b w:val="0"/>
-                <w:i w:val="0"/>
-                <w:sz w:val="19"/>
-              </w:rPr>
-              <w:t>15 Oct 2026 20:08</w:t>
-            </w:r>
-          </w:p>
-        </w:tc>
-        <w:tc>
-          <w:tcPr>
-            <w:tcW w:type="dxa" w:w="1700"/>
-            <w:shd w:val="clear" w:color="auto" w:fill="FFFFFF"/>
-            <w:tcMar>
-              <w:top w:w="80" w:type="dxa"/>
-              <w:bottom w:w="80" w:type="dxa"/>
-              <w:left w:w="100" w:type="dxa"/>
-              <w:right w:w="100" w:type="dxa"/>
-            </w:tcMar>
-          </w:tcPr>
-          <w:p>
-            <w:pPr>
-              <w:spacing w:after="0"/>
-            </w:pPr>
-            <w:r>
-              <w:rPr>
-                <w:rFonts w:ascii="Calibri" w:hAnsi="Calibri"/>
-                <w:b w:val="0"/>
-                <w:i w:val="0"/>
-                <w:sz w:val="19"/>
-              </w:rPr>
-              <w:t>KUSH AGHERA</w:t>
-            </w:r>
-          </w:p>
-        </w:tc>
-        <w:tc>
-          <w:tcPr>
-            <w:tcW w:type="dxa" w:w="2900"/>
-            <w:shd w:val="clear" w:color="auto" w:fill="FFFFFF"/>
-            <w:tcMar>
-              <w:top w:w="80" w:type="dxa"/>
-              <w:bottom w:w="80" w:type="dxa"/>
-              <w:left w:w="100" w:type="dxa"/>
-              <w:right w:w="100" w:type="dxa"/>
-            </w:tcMar>
-          </w:tcPr>
-          <w:p>
-            <w:pPr>
-              <w:spacing w:after="0"/>
-            </w:pPr>
-            <w:r>
-              <w:rPr>
-                <w:rFonts w:ascii="Calibri" w:hAnsi="Calibri"/>
-                <w:b w:val="0"/>
-                <w:i w:val="0"/>
-                <w:sz w:val="19"/>
-              </w:rPr>
-              <w:t>Initial commit</w:t>
-            </w:r>
-          </w:p>
-        </w:tc>
-        <w:tc>
-          <w:tcPr>
-            <w:tcW w:type="dxa" w:w="1760"/>
-            <w:shd w:val="clear" w:color="auto" w:fill="FFFFFF"/>
-            <w:tcMar>
-              <w:top w:w="80" w:type="dxa"/>
-              <w:bottom w:w="80" w:type="dxa"/>
-              <w:left w:w="100" w:type="dxa"/>
-              <w:right w:w="100" w:type="dxa"/>
-            </w:tcMar>
-          </w:tcPr>
-          <w:p>
-            <w:pPr>
-              <w:spacing w:after="0"/>
-            </w:pPr>
-            <w:r>
-              <w:rPr>
-                <w:rFonts w:ascii="Calibri" w:hAnsi="Calibri"/>
-                <w:b w:val="0"/>
-                <w:i w:val="0"/>
-                <w:sz w:val="19"/>
-              </w:rPr>
-              <w:t>1 file, +1 / −0 lines</w:t>
-            </w:r>
-          </w:p>
-        </w:tc>
-      </w:tr>
-      <w:tr>
-        <w:trPr>
-          <w:cantSplit/>
-        </w:trPr>
-        <w:tc>
-          <w:tcPr>
-            <w:tcW w:type="dxa" w:w="1100"/>
-            <w:shd w:val="clear" w:color="auto" w:fill="EEF3FA"/>
-            <w:tcMar>
-              <w:top w:w="80" w:type="dxa"/>
-              <w:bottom w:w="80" w:type="dxa"/>
-              <w:left w:w="100" w:type="dxa"/>
-              <w:right w:w="100" w:type="dxa"/>
-            </w:tcMar>
-          </w:tcPr>
-          <w:p>
-            <w:pPr>
-              <w:spacing w:after="0"/>
-            </w:pPr>
-            <w:r>
-              <w:rPr>
-                <w:rFonts w:ascii="Calibri" w:hAnsi="Calibri"/>
-                <w:b/>
-                <w:i w:val="0"/>
-                <w:sz w:val="19"/>
-              </w:rPr>
-              <w:t>49b7061</w:t>
-            </w:r>
-          </w:p>
-        </w:tc>
-        <w:tc>
-          <w:tcPr>
-            <w:tcW w:type="dxa" w:w="1900"/>
-            <w:shd w:val="clear" w:color="auto" w:fill="EEF3FA"/>
-            <w:tcMar>
-              <w:top w:w="80" w:type="dxa"/>
-              <w:bottom w:w="80" w:type="dxa"/>
-              <w:left w:w="100" w:type="dxa"/>
-              <w:right w:w="100" w:type="dxa"/>
-            </w:tcMar>
-          </w:tcPr>
-          <w:p>
-            <w:pPr>
-              <w:spacing w:after="0"/>
-            </w:pPr>
-            <w:r>
-              <w:rPr>
-                <w:rFonts w:ascii="Calibri" w:hAnsi="Calibri"/>
-                <w:b w:val="0"/>
-                <w:i w:val="0"/>
-                <w:sz w:val="19"/>
-              </w:rPr>
-              <w:t>15 Oct 2026 20:10</w:t>
-            </w:r>
-          </w:p>
-        </w:tc>
-        <w:tc>
-          <w:tcPr>
-            <w:tcW w:type="dxa" w:w="1700"/>
-            <w:shd w:val="clear" w:color="auto" w:fill="EEF3FA"/>
-            <w:tcMar>
-              <w:top w:w="80" w:type="dxa"/>
-              <w:bottom w:w="80" w:type="dxa"/>
-              <w:left w:w="100" w:type="dxa"/>
-              <w:right w:w="100" w:type="dxa"/>
-            </w:tcMar>
-          </w:tcPr>
-          <w:p>
-            <w:pPr>
-              <w:spacing w:after="0"/>
-            </w:pPr>
-            <w:r>
-              <w:rPr>
-                <w:rFonts w:ascii="Calibri" w:hAnsi="Calibri"/>
-                <w:b w:val="0"/>
-                <w:i w:val="0"/>
-                <w:sz w:val="19"/>
-              </w:rPr>
-              <w:t>KUSH AGHERA</w:t>
-            </w:r>
-          </w:p>
-        </w:tc>
-        <w:tc>
-          <w:tcPr>
-            <w:tcW w:type="dxa" w:w="2900"/>
-            <w:shd w:val="clear" w:color="auto" w:fill="EEF3FA"/>
-            <w:tcMar>
-              <w:top w:w="80" w:type="dxa"/>
-              <w:bottom w:w="80" w:type="dxa"/>
-              <w:left w:w="100" w:type="dxa"/>
-              <w:right w:w="100" w:type="dxa"/>
-            </w:tcMar>
-          </w:tcPr>
-          <w:p>
-            <w:pPr>
-              <w:spacing w:after="0"/>
-            </w:pPr>
-            <w:r>
-              <w:rPr>
-                <w:rFonts w:ascii="Calibri" w:hAnsi="Calibri"/>
-                <w:b w:val="0"/>
-                <w:i w:val="0"/>
-                <w:sz w:val="19"/>
-              </w:rPr>
-              <w:t>INITIALIZED</w:t>
-            </w:r>
-          </w:p>
-        </w:tc>
-        <w:tc>
-          <w:tcPr>
-            <w:tcW w:type="dxa" w:w="1760"/>
-            <w:shd w:val="clear" w:color="auto" w:fill="EEF3FA"/>
-            <w:tcMar>
-              <w:top w:w="80" w:type="dxa"/>
-              <w:bottom w:w="80" w:type="dxa"/>
-              <w:left w:w="100" w:type="dxa"/>
-              <w:right w:w="100" w:type="dxa"/>
-            </w:tcMar>
-          </w:tcPr>
-          <w:p>
-            <w:pPr>
-              <w:spacing w:after="0"/>
-            </w:pPr>
-            <w:r>
-              <w:rPr>
-                <w:rFonts w:ascii="Calibri" w:hAnsi="Calibri"/>
-                <w:b w:val="0"/>
-                <w:i w:val="0"/>
-                <w:sz w:val="19"/>
-              </w:rPr>
-              <w:t>1 file, +6 / −1 lines</w:t>
-            </w:r>
-          </w:p>
-        </w:tc>
-      </w:tr>
-      <w:tr>
-        <w:trPr>
-          <w:cantSplit/>
-        </w:trPr>
-        <w:tc>
-          <w:tcPr>
-            <w:tcW w:type="dxa" w:w="1100"/>
-            <w:shd w:val="clear" w:color="auto" w:fill="FFFFFF"/>
-            <w:tcMar>
-              <w:top w:w="80" w:type="dxa"/>
-              <w:bottom w:w="80" w:type="dxa"/>
-              <w:left w:w="100" w:type="dxa"/>
-              <w:right w:w="100" w:type="dxa"/>
-            </w:tcMar>
-          </w:tcPr>
-          <w:p>
-            <w:pPr>
-              <w:spacing w:after="0"/>
-            </w:pPr>
-            <w:r>
-              <w:rPr>
-                <w:rFonts w:ascii="Calibri" w:hAnsi="Calibri"/>
-                <w:b/>
-                <w:i w:val="0"/>
-                <w:sz w:val="19"/>
-              </w:rPr>
-              <w:t>eb8542b</w:t>
-            </w:r>
-          </w:p>
-        </w:tc>
-        <w:tc>
-          <w:tcPr>
-            <w:tcW w:type="dxa" w:w="1900"/>
-            <w:shd w:val="clear" w:color="auto" w:fill="FFFFFF"/>
-            <w:tcMar>
-              <w:top w:w="80" w:type="dxa"/>
-              <w:bottom w:w="80" w:type="dxa"/>
-              <w:left w:w="100" w:type="dxa"/>
-              <w:right w:w="100" w:type="dxa"/>
-            </w:tcMar>
-          </w:tcPr>
-          <w:p>
-            <w:pPr>
-              <w:spacing w:after="0"/>
-            </w:pPr>
-            <w:r>
-              <w:rPr>
-                <w:rFonts w:ascii="Calibri" w:hAnsi="Calibri"/>
-                <w:b w:val="0"/>
-                <w:i w:val="0"/>
-                <w:sz w:val="19"/>
-              </w:rPr>
-              <w:t>15 Oct 2026 21:13</w:t>
-            </w:r>
-          </w:p>
-        </w:tc>
-        <w:tc>
-          <w:tcPr>
-            <w:tcW w:type="dxa" w:w="1700"/>
-            <w:shd w:val="clear" w:color="auto" w:fill="FFFFFF"/>
-            <w:tcMar>
-              <w:top w:w="80" w:type="dxa"/>
-              <w:bottom w:w="80" w:type="dxa"/>
-              <w:left w:w="100" w:type="dxa"/>
-              <w:right w:w="100" w:type="dxa"/>
-            </w:tcMar>
-          </w:tcPr>
-          <w:p>
-            <w:pPr>
-              <w:spacing w:after="0"/>
-            </w:pPr>
-            <w:r>
-              <w:rPr>
-                <w:rFonts w:ascii="Calibri" w:hAnsi="Calibri"/>
-                <w:b w:val="0"/>
-                <w:i w:val="0"/>
-                <w:sz w:val="19"/>
-              </w:rPr>
-              <w:t>Kush Aghera</w:t>
-            </w:r>
-          </w:p>
-        </w:tc>
-        <w:tc>
-          <w:tcPr>
-            <w:tcW w:type="dxa" w:w="2900"/>
-            <w:shd w:val="clear" w:color="auto" w:fill="FFFFFF"/>
-            <w:tcMar>
-              <w:top w:w="80" w:type="dxa"/>
-              <w:bottom w:w="80" w:type="dxa"/>
-              <w:left w:w="100" w:type="dxa"/>
-              <w:right w:w="100" w:type="dxa"/>
-            </w:tcMar>
-          </w:tcPr>
-          <w:p>
-            <w:pPr>
-              <w:spacing w:after="0"/>
-            </w:pPr>
-            <w:r>
-              <w:rPr>
-                <w:rFonts w:ascii="Calibri" w:hAnsi="Calibri"/>
-                <w:b w:val="0"/>
-                <w:i w:val="0"/>
-                <w:sz w:val="19"/>
-              </w:rPr>
-              <w:t>init project base</w:t>
-            </w:r>
-          </w:p>
-        </w:tc>
-        <w:tc>
-          <w:tcPr>
-            <w:tcW w:type="dxa" w:w="1760"/>
-            <w:shd w:val="clear" w:color="auto" w:fill="FFFFFF"/>
-            <w:tcMar>
-              <w:top w:w="80" w:type="dxa"/>
-              <w:bottom w:w="80" w:type="dxa"/>
-              <w:left w:w="100" w:type="dxa"/>
-              <w:right w:w="100" w:type="dxa"/>
-            </w:tcMar>
-          </w:tcPr>
-          <w:p>
-            <w:pPr>
-              <w:spacing w:after="0"/>
-            </w:pPr>
-            <w:r>
-              <w:rPr>
-                <w:rFonts w:ascii="Calibri" w:hAnsi="Calibri"/>
-                <w:b w:val="0"/>
-                <w:i w:val="0"/>
-                <w:sz w:val="19"/>
-              </w:rPr>
-              <w:t>3 files, +81 / −0 lines</w:t>
-            </w:r>
-          </w:p>
-        </w:tc>
-      </w:tr>
-      <w:tr>
-        <w:trPr>
-          <w:cantSplit/>
-        </w:trPr>
-        <w:tc>
-          <w:tcPr>
-            <w:tcW w:type="dxa" w:w="1100"/>
-            <w:shd w:val="clear" w:color="auto" w:fill="EEF3FA"/>
-            <w:tcMar>
-              <w:top w:w="80" w:type="dxa"/>
-              <w:bottom w:w="80" w:type="dxa"/>
-              <w:left w:w="100" w:type="dxa"/>
-              <w:right w:w="100" w:type="dxa"/>
-            </w:tcMar>
-          </w:tcPr>
-          <w:p>
-            <w:pPr>
-              <w:spacing w:after="0"/>
-            </w:pPr>
-            <w:r>
-              <w:rPr>
-                <w:rFonts w:ascii="Calibri" w:hAnsi="Calibri"/>
-                <w:b/>
-                <w:i w:val="0"/>
-                <w:sz w:val="19"/>
-              </w:rPr>
-              <w:t>a2401f6</w:t>
-            </w:r>
-          </w:p>
-        </w:tc>
-        <w:tc>
-          <w:tcPr>
-            <w:tcW w:type="dxa" w:w="1900"/>
-            <w:shd w:val="clear" w:color="auto" w:fill="EEF3FA"/>
-            <w:tcMar>
-              <w:top w:w="80" w:type="dxa"/>
-              <w:bottom w:w="80" w:type="dxa"/>
-              <w:left w:w="100" w:type="dxa"/>
-              <w:right w:w="100" w:type="dxa"/>
-            </w:tcMar>
-          </w:tcPr>
-          <w:p>
-            <w:pPr>
-              <w:spacing w:after="0"/>
-            </w:pPr>
-            <w:r>
-              <w:rPr>
-                <w:rFonts w:ascii="Calibri" w:hAnsi="Calibri"/>
-                <w:b w:val="0"/>
-                <w:i w:val="0"/>
-                <w:sz w:val="19"/>
-              </w:rPr>
-              <w:t>15 Oct 2026 21:13</w:t>
-            </w:r>
-          </w:p>
-        </w:tc>
-        <w:tc>
-          <w:tcPr>
-            <w:tcW w:type="dxa" w:w="1700"/>
-            <w:shd w:val="clear" w:color="auto" w:fill="EEF3FA"/>
-            <w:tcMar>
-              <w:top w:w="80" w:type="dxa"/>
-              <w:bottom w:w="80" w:type="dxa"/>
-              <w:left w:w="100" w:type="dxa"/>
-              <w:right w:w="100" w:type="dxa"/>
-            </w:tcMar>
-          </w:tcPr>
-          <w:p>
-            <w:pPr>
-              <w:spacing w:after="0"/>
-            </w:pPr>
-            <w:r>
-              <w:rPr>
-                <w:rFonts w:ascii="Calibri" w:hAnsi="Calibri"/>
-                <w:b w:val="0"/>
-                <w:i w:val="0"/>
-                <w:sz w:val="19"/>
-              </w:rPr>
-              <w:t>Kush Aghera</w:t>
-            </w:r>
-          </w:p>
-        </w:tc>
-        <w:tc>
-          <w:tcPr>
-            <w:tcW w:type="dxa" w:w="2900"/>
-            <w:shd w:val="clear" w:color="auto" w:fill="EEF3FA"/>
-            <w:tcMar>
-              <w:top w:w="80" w:type="dxa"/>
-              <w:bottom w:w="80" w:type="dxa"/>
-              <w:left w:w="100" w:type="dxa"/>
-              <w:right w:w="100" w:type="dxa"/>
-            </w:tcMar>
-          </w:tcPr>
-          <w:p>
-            <w:pPr>
-              <w:spacing w:after="0"/>
-            </w:pPr>
-            <w:r>
-              <w:rPr>
-                <w:rFonts w:ascii="Calibri" w:hAnsi="Calibri"/>
-                <w:b w:val="0"/>
-                <w:i w:val="0"/>
-                <w:sz w:val="19"/>
-              </w:rPr>
-              <w:t>add agent core</w:t>
-            </w:r>
-          </w:p>
-        </w:tc>
-        <w:tc>
-          <w:tcPr>
-            <w:tcW w:type="dxa" w:w="1760"/>
-            <w:shd w:val="clear" w:color="auto" w:fill="EEF3FA"/>
-            <w:tcMar>
-              <w:top w:w="80" w:type="dxa"/>
-              <w:bottom w:w="80" w:type="dxa"/>
-              <w:left w:w="100" w:type="dxa"/>
-              <w:right w:w="100" w:type="dxa"/>
-            </w:tcMar>
-          </w:tcPr>
-          <w:p>
-            <w:pPr>
-              <w:spacing w:after="0"/>
-            </w:pPr>
-            <w:r>
-              <w:rPr>
-                <w:rFonts w:ascii="Calibri" w:hAnsi="Calibri"/>
-                <w:b w:val="0"/>
-                <w:i w:val="0"/>
-                <w:sz w:val="19"/>
-              </w:rPr>
-              <w:t>9 files, +1773 / −0 lines</w:t>
-            </w:r>
-          </w:p>
-        </w:tc>
-      </w:tr>
-      <w:tr>
-        <w:trPr>
-          <w:cantSplit/>
-        </w:trPr>
-        <w:tc>
-          <w:tcPr>
-            <w:tcW w:type="dxa" w:w="1100"/>
-            <w:shd w:val="clear" w:color="auto" w:fill="FFFFFF"/>
-            <w:tcMar>
-              <w:top w:w="80" w:type="dxa"/>
-              <w:bottom w:w="80" w:type="dxa"/>
-              <w:left w:w="100" w:type="dxa"/>
-              <w:right w:w="100" w:type="dxa"/>
-            </w:tcMar>
-          </w:tcPr>
-          <w:p>
-            <w:pPr>
-              <w:spacing w:after="0"/>
-            </w:pPr>
-            <w:r>
-              <w:rPr>
-                <w:rFonts w:ascii="Calibri" w:hAnsi="Calibri"/>
-                <w:b/>
-                <w:i w:val="0"/>
-                <w:sz w:val="19"/>
-              </w:rPr>
-              <w:t>d7cfe53</w:t>
-            </w:r>
-          </w:p>
-        </w:tc>
-        <w:tc>
-          <w:tcPr>
-            <w:tcW w:type="dxa" w:w="1900"/>
-            <w:shd w:val="clear" w:color="auto" w:fill="FFFFFF"/>
-            <w:tcMar>
-              <w:top w:w="80" w:type="dxa"/>
-              <w:bottom w:w="80" w:type="dxa"/>
-              <w:left w:w="100" w:type="dxa"/>
-              <w:right w:w="100" w:type="dxa"/>
-            </w:tcMar>
-          </w:tcPr>
-          <w:p>
-            <w:pPr>
-              <w:spacing w:after="0"/>
-            </w:pPr>
-            <w:r>
-              <w:rPr>
-                <w:rFonts w:ascii="Calibri" w:hAnsi="Calibri"/>
-                <w:b w:val="0"/>
-                <w:i w:val="0"/>
-                <w:sz w:val="19"/>
-              </w:rPr>
-              <w:t>15 Oct 2026 21:14</w:t>
-            </w:r>
-          </w:p>
-        </w:tc>
-        <w:tc>
-          <w:tcPr>
-            <w:tcW w:type="dxa" w:w="1700"/>
-            <w:shd w:val="clear" w:color="auto" w:fill="FFFFFF"/>
-            <w:tcMar>
-              <w:top w:w="80" w:type="dxa"/>
-              <w:bottom w:w="80" w:type="dxa"/>
-              <w:left w:w="100" w:type="dxa"/>
-              <w:right w:w="100" w:type="dxa"/>
-            </w:tcMar>
-          </w:tcPr>
-          <w:p>
-            <w:pPr>
-              <w:spacing w:after="0"/>
-            </w:pPr>
-            <w:r>
-              <w:rPr>
-                <w:rFonts w:ascii="Calibri" w:hAnsi="Calibri"/>
-                <w:b w:val="0"/>
-                <w:i w:val="0"/>
-                <w:sz w:val="19"/>
-              </w:rPr>
-              <w:t>Kush Aghera</w:t>
-            </w:r>
-          </w:p>
-        </w:tc>
-        <w:tc>
-          <w:tcPr>
-            <w:tcW w:type="dxa" w:w="2900"/>
-            <w:shd w:val="clear" w:color="auto" w:fill="FFFFFF"/>
-            <w:tcMar>
-              <w:top w:w="80" w:type="dxa"/>
-              <w:bottom w:w="80" w:type="dxa"/>
-              <w:left w:w="100" w:type="dxa"/>
-              <w:right w:w="100" w:type="dxa"/>
-            </w:tcMar>
-          </w:tcPr>
-          <w:p>
-            <w:pPr>
-              <w:spacing w:after="0"/>
-            </w:pPr>
-            <w:r>
-              <w:rPr>
-                <w:rFonts w:ascii="Calibri" w:hAnsi="Calibri"/>
-                <w:b w:val="0"/>
-                <w:i w:val="0"/>
-                <w:sz w:val="19"/>
-              </w:rPr>
-              <w:t>add test suite</w:t>
-            </w:r>
-          </w:p>
-        </w:tc>
-        <w:tc>
-          <w:tcPr>
-            <w:tcW w:type="dxa" w:w="1760"/>
-            <w:shd w:val="clear" w:color="auto" w:fill="FFFFFF"/>
-            <w:tcMar>
-              <w:top w:w="80" w:type="dxa"/>
-              <w:bottom w:w="80" w:type="dxa"/>
-              <w:left w:w="100" w:type="dxa"/>
-              <w:right w:w="100" w:type="dxa"/>
-            </w:tcMar>
-          </w:tcPr>
-          <w:p>
-            <w:pPr>
-              <w:spacing w:after="0"/>
-            </w:pPr>
-            <w:r>
-              <w:rPr>
-                <w:rFonts w:ascii="Calibri" w:hAnsi="Calibri"/>
-                <w:b w:val="0"/>
-                <w:i w:val="0"/>
-                <w:sz w:val="19"/>
-              </w:rPr>
-              <w:t>6 files, +398 / −0 lines</w:t>
-            </w:r>
-          </w:p>
-        </w:tc>
-      </w:tr>
-      <w:tr>
-        <w:trPr>
-          <w:cantSplit/>
-        </w:trPr>
-        <w:tc>
-          <w:tcPr>
-            <w:tcW w:type="dxa" w:w="1100"/>
-            <w:shd w:val="clear" w:color="auto" w:fill="EEF3FA"/>
-            <w:tcMar>
-              <w:top w:w="80" w:type="dxa"/>
-              <w:bottom w:w="80" w:type="dxa"/>
-              <w:left w:w="100" w:type="dxa"/>
-              <w:right w:w="100" w:type="dxa"/>
-            </w:tcMar>
-          </w:tcPr>
-          <w:p>
-            <w:pPr>
-              <w:spacing w:after="0"/>
-            </w:pPr>
-            <w:r>
-              <w:rPr>
-                <w:rFonts w:ascii="Calibri" w:hAnsi="Calibri"/>
-                <w:b/>
-                <w:i w:val="0"/>
-                <w:sz w:val="19"/>
-              </w:rPr>
-              <w:t>1912a9e</w:t>
-            </w:r>
-          </w:p>
-        </w:tc>
-        <w:tc>
-          <w:tcPr>
-            <w:tcW w:type="dxa" w:w="1900"/>
-            <w:shd w:val="clear" w:color="auto" w:fill="EEF3FA"/>
-            <w:tcMar>
-              <w:top w:w="80" w:type="dxa"/>
-              <w:bottom w:w="80" w:type="dxa"/>
-              <w:left w:w="100" w:type="dxa"/>
-              <w:right w:w="100" w:type="dxa"/>
-            </w:tcMar>
-          </w:tcPr>
-          <w:p>
-            <w:pPr>
-              <w:spacing w:after="0"/>
-            </w:pPr>
-            <w:r>
-              <w:rPr>
-                <w:rFonts w:ascii="Calibri" w:hAnsi="Calibri"/>
-                <w:b w:val="0"/>
-                <w:i w:val="0"/>
-                <w:sz w:val="19"/>
-              </w:rPr>
-              <w:t>15 Oct 2026 21:14</w:t>
-            </w:r>
-          </w:p>
-        </w:tc>
-        <w:tc>
-          <w:tcPr>
-            <w:tcW w:type="dxa" w:w="1700"/>
-            <w:shd w:val="clear" w:color="auto" w:fill="EEF3FA"/>
-            <w:tcMar>
-              <w:top w:w="80" w:type="dxa"/>
-              <w:bottom w:w="80" w:type="dxa"/>
-              <w:left w:w="100" w:type="dxa"/>
-              <w:right w:w="100" w:type="dxa"/>
-            </w:tcMar>
-          </w:tcPr>
-          <w:p>
-            <w:pPr>
-              <w:spacing w:after="0"/>
-            </w:pPr>
-            <w:r>
-              <w:rPr>
-                <w:rFonts w:ascii="Calibri" w:hAnsi="Calibri"/>
-                <w:b w:val="0"/>
-                <w:i w:val="0"/>
-                <w:sz w:val="19"/>
-              </w:rPr>
-              <w:t>Kush Aghera</w:t>
-            </w:r>
-          </w:p>
-        </w:tc>
-        <w:tc>
-          <w:tcPr>
-            <w:tcW w:type="dxa" w:w="2900"/>
-            <w:shd w:val="clear" w:color="auto" w:fill="EEF3FA"/>
-            <w:tcMar>
-              <w:top w:w="80" w:type="dxa"/>
-              <w:bottom w:w="80" w:type="dxa"/>
-              <w:left w:w="100" w:type="dxa"/>
-              <w:right w:w="100" w:type="dxa"/>
-            </w:tcMar>
-          </w:tcPr>
-          <w:p>
-            <w:pPr>
-              <w:spacing w:after="0"/>
-            </w:pPr>
-            <w:r>
-              <w:rPr>
-                <w:rFonts w:ascii="Calibri" w:hAnsi="Calibri"/>
-                <w:b w:val="0"/>
-                <w:i w:val="0"/>
-                <w:sz w:val="19"/>
-              </w:rPr>
-              <w:t>add documentation files</w:t>
-            </w:r>
-          </w:p>
-        </w:tc>
-        <w:tc>
-          <w:tcPr>
-            <w:tcW w:type="dxa" w:w="1760"/>
-            <w:shd w:val="clear" w:color="auto" w:fill="EEF3FA"/>
-            <w:tcMar>
-              <w:top w:w="80" w:type="dxa"/>
-              <w:bottom w:w="80" w:type="dxa"/>
-              <w:left w:w="100" w:type="dxa"/>
-              <w:right w:w="100" w:type="dxa"/>
-            </w:tcMar>
-          </w:tcPr>
-          <w:p>
-            <w:pPr>
-              <w:spacing w:after="0"/>
-            </w:pPr>
-            <w:r>
-              <w:rPr>
-                <w:rFonts w:ascii="Calibri" w:hAnsi="Calibri"/>
-                <w:b w:val="0"/>
-                <w:i w:val="0"/>
-                <w:sz w:val="19"/>
-              </w:rPr>
-              <w:t>4 files, +325 / −4 lines</w:t>
-            </w:r>
-          </w:p>
-        </w:tc>
-      </w:tr>
-      <w:tr>
-        <w:trPr>
-          <w:cantSplit/>
-        </w:trPr>
-        <w:tc>
-          <w:tcPr>
-            <w:tcW w:type="dxa" w:w="1100"/>
-            <w:shd w:val="clear" w:color="auto" w:fill="FFFFFF"/>
-            <w:tcMar>
-              <w:top w:w="80" w:type="dxa"/>
-              <w:bottom w:w="80" w:type="dxa"/>
-              <w:left w:w="100" w:type="dxa"/>
-              <w:right w:w="100" w:type="dxa"/>
-            </w:tcMar>
-          </w:tcPr>
-          <w:p>
-            <w:pPr>
-              <w:spacing w:after="0"/>
-            </w:pPr>
-            <w:r>
-              <w:rPr>
-                <w:rFonts w:ascii="Calibri" w:hAnsi="Calibri"/>
-                <w:b/>
-                <w:i w:val="0"/>
-                <w:sz w:val="19"/>
-              </w:rPr>
-              <w:t>759ba9c</w:t>
-            </w:r>
-          </w:p>
-        </w:tc>
-        <w:tc>
-          <w:tcPr>
-            <w:tcW w:type="dxa" w:w="1900"/>
-            <w:shd w:val="clear" w:color="auto" w:fill="FFFFFF"/>
-            <w:tcMar>
-              <w:top w:w="80" w:type="dxa"/>
-              <w:bottom w:w="80" w:type="dxa"/>
-              <w:left w:w="100" w:type="dxa"/>
-              <w:right w:w="100" w:type="dxa"/>
-            </w:tcMar>
-          </w:tcPr>
-          <w:p>
-            <w:pPr>
-              <w:spacing w:after="0"/>
-            </w:pPr>
-            <w:r>
-              <w:rPr>
-                <w:rFonts w:ascii="Calibri" w:hAnsi="Calibri"/>
-                <w:b w:val="0"/>
-                <w:i w:val="0"/>
-                <w:sz w:val="19"/>
-              </w:rPr>
-              <w:t>15 Oct 2026 21:40</w:t>
-            </w:r>
-          </w:p>
-        </w:tc>
-        <w:tc>
-          <w:tcPr>
-            <w:tcW w:type="dxa" w:w="1700"/>
-            <w:shd w:val="clear" w:color="auto" w:fill="FFFFFF"/>
-            <w:tcMar>
-              <w:top w:w="80" w:type="dxa"/>
-              <w:bottom w:w="80" w:type="dxa"/>
-              <w:left w:w="100" w:type="dxa"/>
-              <w:right w:w="100" w:type="dxa"/>
-            </w:tcMar>
-          </w:tcPr>
-          <w:p>
-            <w:pPr>
-              <w:spacing w:after="0"/>
-            </w:pPr>
-            <w:r>
-              <w:rPr>
-                <w:rFonts w:ascii="Calibri" w:hAnsi="Calibri"/>
-                <w:b w:val="0"/>
-                <w:i w:val="0"/>
-                <w:sz w:val="19"/>
-              </w:rPr>
-              <w:t>KUSH AGHERA</w:t>
-            </w:r>
-          </w:p>
-        </w:tc>
-        <w:tc>
-          <w:tcPr>
-            <w:tcW w:type="dxa" w:w="2900"/>
-            <w:shd w:val="clear" w:color="auto" w:fill="FFFFFF"/>
-            <w:tcMar>
-              <w:top w:w="80" w:type="dxa"/>
-              <w:bottom w:w="80" w:type="dxa"/>
-              <w:left w:w="100" w:type="dxa"/>
-              <w:right w:w="100" w:type="dxa"/>
-            </w:tcMar>
-          </w:tcPr>
-          <w:p>
-            <w:pPr>
-              <w:spacing w:after="0"/>
-            </w:pPr>
-            <w:r>
-              <w:rPr>
-                <w:rFonts w:ascii="Calibri" w:hAnsi="Calibri"/>
-                <w:b w:val="0"/>
-                <w:i w:val="0"/>
-                <w:sz w:val="19"/>
-              </w:rPr>
-              <w:t>started</w:t>
-            </w:r>
-          </w:p>
-        </w:tc>
-        <w:tc>
-          <w:tcPr>
-            <w:tcW w:type="dxa" w:w="1760"/>
-            <w:shd w:val="clear" w:color="auto" w:fill="FFFFFF"/>
-            <w:tcMar>
-              <w:top w:w="80" w:type="dxa"/>
-              <w:bottom w:w="80" w:type="dxa"/>
-              <w:left w:w="100" w:type="dxa"/>
-              <w:right w:w="100" w:type="dxa"/>
-            </w:tcMar>
-          </w:tcPr>
-          <w:p>
-            <w:pPr>
-              <w:spacing w:after="0"/>
-            </w:pPr>
-            <w:r>
-              <w:rPr>
-                <w:rFonts w:ascii="Calibri" w:hAnsi="Calibri"/>
-                <w:b w:val="0"/>
-                <w:i w:val="0"/>
-                <w:sz w:val="19"/>
-              </w:rPr>
-              <w:t>1 file, +1 / −1 lines</w:t>
-            </w:r>
-          </w:p>
-        </w:tc>
-      </w:tr>
-      <w:tr>
-        <w:trPr>
-          <w:cantSplit/>
-        </w:trPr>
-        <w:tc>
-          <w:tcPr>
-            <w:tcW w:type="dxa" w:w="1100"/>
-            <w:shd w:val="clear" w:color="auto" w:fill="EEF3FA"/>
-            <w:tcMar>
-              <w:top w:w="80" w:type="dxa"/>
-              <w:bottom w:w="80" w:type="dxa"/>
-              <w:left w:w="100" w:type="dxa"/>
-              <w:right w:w="100" w:type="dxa"/>
-            </w:tcMar>
-          </w:tcPr>
-          <w:p>
-            <w:pPr>
-              <w:spacing w:after="0"/>
-            </w:pPr>
-            <w:r>
-              <w:rPr>
-                <w:rFonts w:ascii="Calibri" w:hAnsi="Calibri"/>
-                <w:b/>
-                <w:i w:val="0"/>
-                <w:sz w:val="19"/>
-              </w:rPr>
-              <w:t>aca62bb</w:t>
-            </w:r>
-          </w:p>
-        </w:tc>
-        <w:tc>
-          <w:tcPr>
-            <w:tcW w:type="dxa" w:w="1900"/>
-            <w:shd w:val="clear" w:color="auto" w:fill="EEF3FA"/>
-            <w:tcMar>
-              <w:top w:w="80" w:type="dxa"/>
-              <w:bottom w:w="80" w:type="dxa"/>
-              <w:left w:w="100" w:type="dxa"/>
-              <w:right w:w="100" w:type="dxa"/>
-            </w:tcMar>
-          </w:tcPr>
-          <w:p>
-            <w:pPr>
-              <w:spacing w:after="0"/>
-            </w:pPr>
-            <w:r>
-              <w:rPr>
-                <w:rFonts w:ascii="Calibri" w:hAnsi="Calibri"/>
-                <w:b w:val="0"/>
-                <w:i w:val="0"/>
-                <w:sz w:val="19"/>
-              </w:rPr>
-              <w:t>15 Oct 2026 22:17</w:t>
-            </w:r>
-          </w:p>
-        </w:tc>
-        <w:tc>
-          <w:tcPr>
-            <w:tcW w:type="dxa" w:w="1700"/>
-            <w:shd w:val="clear" w:color="auto" w:fill="EEF3FA"/>
-            <w:tcMar>
-              <w:top w:w="80" w:type="dxa"/>
-              <w:bottom w:w="80" w:type="dxa"/>
-              <w:left w:w="100" w:type="dxa"/>
-              <w:right w:w="100" w:type="dxa"/>
-            </w:tcMar>
-          </w:tcPr>
-          <w:p>
-            <w:pPr>
-              <w:spacing w:after="0"/>
-            </w:pPr>
-            <w:r>
-              <w:rPr>
-                <w:rFonts w:ascii="Calibri" w:hAnsi="Calibri"/>
-                <w:b w:val="0"/>
-                <w:i w:val="0"/>
-                <w:sz w:val="19"/>
-              </w:rPr>
-              <w:t>Sandeep-More-1610</w:t>
-            </w:r>
-          </w:p>
-        </w:tc>
-        <w:tc>
-          <w:tcPr>
-            <w:tcW w:type="dxa" w:w="2900"/>
-            <w:shd w:val="clear" w:color="auto" w:fill="EEF3FA"/>
-            <w:tcMar>
-              <w:top w:w="80" w:type="dxa"/>
-              <w:bottom w:w="80" w:type="dxa"/>
-              <w:left w:w="100" w:type="dxa"/>
-              <w:right w:w="100" w:type="dxa"/>
-            </w:tcMar>
-          </w:tcPr>
-          <w:p>
-            <w:pPr>
-              <w:spacing w:after="0"/>
-            </w:pPr>
-            <w:r>
-              <w:rPr>
-                <w:rFonts w:ascii="Calibri" w:hAnsi="Calibri"/>
-                <w:b w:val="0"/>
-                <w:i w:val="0"/>
-                <w:sz w:val="19"/>
-              </w:rPr>
-              <w:t>Update member details for Sandeep More</w:t>
-            </w:r>
-          </w:p>
-        </w:tc>
-        <w:tc>
-          <w:tcPr>
-            <w:tcW w:type="dxa" w:w="1760"/>
-            <w:shd w:val="clear" w:color="auto" w:fill="EEF3FA"/>
-            <w:tcMar>
-              <w:top w:w="80" w:type="dxa"/>
-              <w:bottom w:w="80" w:type="dxa"/>
-              <w:left w:w="100" w:type="dxa"/>
-              <w:right w:w="100" w:type="dxa"/>
-            </w:tcMar>
-          </w:tcPr>
-          <w:p>
-            <w:pPr>
-              <w:spacing w:after="0"/>
-            </w:pPr>
-            <w:r>
-              <w:rPr>
-                <w:rFonts w:ascii="Calibri" w:hAnsi="Calibri"/>
-                <w:b w:val="0"/>
-                <w:i w:val="0"/>
-                <w:sz w:val="19"/>
-              </w:rPr>
-              <w:t>1 file, +1 / −1 lines</w:t>
-            </w:r>
-          </w:p>
-        </w:tc>
-      </w:tr>
-      <w:tr>
-        <w:trPr>
-          <w:cantSplit/>
-        </w:trPr>
-        <w:tc>
-          <w:tcPr>
-            <w:tcW w:type="dxa" w:w="1100"/>
-            <w:shd w:val="clear" w:color="auto" w:fill="FFFFFF"/>
-            <w:tcMar>
-              <w:top w:w="80" w:type="dxa"/>
-              <w:bottom w:w="80" w:type="dxa"/>
-              <w:left w:w="100" w:type="dxa"/>
-              <w:right w:w="100" w:type="dxa"/>
-            </w:tcMar>
-          </w:tcPr>
-          <w:p>
-            <w:pPr>
-              <w:spacing w:after="0"/>
-            </w:pPr>
-            <w:r>
-              <w:rPr>
-                <w:rFonts w:ascii="Calibri" w:hAnsi="Calibri"/>
-                <w:b/>
-                <w:i w:val="0"/>
-                <w:sz w:val="19"/>
-              </w:rPr>
-              <w:t>d15e083</w:t>
-            </w:r>
-          </w:p>
-        </w:tc>
-        <w:tc>
-          <w:tcPr>
-            <w:tcW w:type="dxa" w:w="1900"/>
-            <w:shd w:val="clear" w:color="auto" w:fill="FFFFFF"/>
-            <w:tcMar>
-              <w:top w:w="80" w:type="dxa"/>
-              <w:bottom w:w="80" w:type="dxa"/>
-              <w:left w:w="100" w:type="dxa"/>
-              <w:right w:w="100" w:type="dxa"/>
-            </w:tcMar>
-          </w:tcPr>
-          <w:p>
-            <w:pPr>
-              <w:spacing w:after="0"/>
-            </w:pPr>
-            <w:r>
-              <w:rPr>
-                <w:rFonts w:ascii="Calibri" w:hAnsi="Calibri"/>
-                <w:b w:val="0"/>
-                <w:i w:val="0"/>
-                <w:sz w:val="19"/>
-              </w:rPr>
-              <w:t>15 Oct 2026 22:21</w:t>
-            </w:r>
-          </w:p>
-        </w:tc>
-        <w:tc>
-          <w:tcPr>
-            <w:tcW w:type="dxa" w:w="1700"/>
-            <w:shd w:val="clear" w:color="auto" w:fill="FFFFFF"/>
-            <w:tcMar>
-              <w:top w:w="80" w:type="dxa"/>
-              <w:bottom w:w="80" w:type="dxa"/>
-              <w:left w:w="100" w:type="dxa"/>
-              <w:right w:w="100" w:type="dxa"/>
-            </w:tcMar>
-          </w:tcPr>
-          <w:p>
-            <w:pPr>
-              <w:spacing w:after="0"/>
-            </w:pPr>
-            <w:r>
-              <w:rPr>
-                <w:rFonts w:ascii="Calibri" w:hAnsi="Calibri"/>
-                <w:b w:val="0"/>
-                <w:i w:val="0"/>
-                <w:sz w:val="19"/>
-              </w:rPr>
-              <w:t>Kush Aghera</w:t>
-            </w:r>
-          </w:p>
-        </w:tc>
-        <w:tc>
-          <w:tcPr>
-            <w:tcW w:type="dxa" w:w="2900"/>
-            <w:shd w:val="clear" w:color="auto" w:fill="FFFFFF"/>
-            <w:tcMar>
-              <w:top w:w="80" w:type="dxa"/>
-              <w:bottom w:w="80" w:type="dxa"/>
-              <w:left w:w="100" w:type="dxa"/>
-              <w:right w:w="100" w:type="dxa"/>
-            </w:tcMar>
-          </w:tcPr>
-          <w:p>
-            <w:pPr>
-              <w:spacing w:after="0"/>
-            </w:pPr>
-            <w:r>
-              <w:rPr>
-                <w:rFonts w:ascii="Calibri" w:hAnsi="Calibri"/>
-                <w:b w:val="0"/>
-                <w:i w:val="0"/>
-                <w:sz w:val="19"/>
-              </w:rPr>
-              <w:t>add review docs</w:t>
-            </w:r>
-          </w:p>
-        </w:tc>
-        <w:tc>
-          <w:tcPr>
-            <w:tcW w:type="dxa" w:w="1760"/>
-            <w:shd w:val="clear" w:color="auto" w:fill="FFFFFF"/>
-            <w:tcMar>
-              <w:top w:w="80" w:type="dxa"/>
-              <w:bottom w:w="80" w:type="dxa"/>
-              <w:left w:w="100" w:type="dxa"/>
-              <w:right w:w="100" w:type="dxa"/>
-            </w:tcMar>
-          </w:tcPr>
-          <w:p>
-            <w:pPr>
-              <w:spacing w:after="0"/>
-            </w:pPr>
-            <w:r>
-              <w:rPr>
-                <w:rFonts w:ascii="Calibri" w:hAnsi="Calibri"/>
-                <w:b w:val="0"/>
-                <w:i w:val="0"/>
-                <w:sz w:val="19"/>
-              </w:rPr>
-              <w:t>2 files (binary: .docx / .pdf / .png)</w:t>
-            </w:r>
-          </w:p>
-        </w:tc>
-      </w:tr>
-      <w:tr>
-        <w:trPr>
-          <w:cantSplit/>
-        </w:trPr>
-        <w:tc>
-          <w:tcPr>
-            <w:tcW w:type="dxa" w:w="1100"/>
-            <w:shd w:val="clear" w:color="auto" w:fill="EEF3FA"/>
-            <w:tcMar>
-              <w:top w:w="80" w:type="dxa"/>
-              <w:bottom w:w="80" w:type="dxa"/>
-              <w:left w:w="100" w:type="dxa"/>
-              <w:right w:w="100" w:type="dxa"/>
-            </w:tcMar>
-          </w:tcPr>
-          <w:p>
-            <w:pPr>
-              <w:spacing w:after="0"/>
-            </w:pPr>
-            <w:r>
-              <w:rPr>
-                <w:rFonts w:ascii="Calibri" w:hAnsi="Calibri"/>
-                <w:b/>
-                <w:i w:val="0"/>
-                <w:sz w:val="19"/>
-              </w:rPr>
-              <w:t>2d64067</w:t>
-            </w:r>
-          </w:p>
-        </w:tc>
-        <w:tc>
-          <w:tcPr>
-            <w:tcW w:type="dxa" w:w="1900"/>
-            <w:shd w:val="clear" w:color="auto" w:fill="EEF3FA"/>
-            <w:tcMar>
-              <w:top w:w="80" w:type="dxa"/>
-              <w:bottom w:w="80" w:type="dxa"/>
-              <w:left w:w="100" w:type="dxa"/>
-              <w:right w:w="100" w:type="dxa"/>
-            </w:tcMar>
-          </w:tcPr>
-          <w:p>
-            <w:pPr>
-              <w:spacing w:after="0"/>
-            </w:pPr>
-            <w:r>
-              <w:rPr>
-                <w:rFonts w:ascii="Calibri" w:hAnsi="Calibri"/>
-                <w:b w:val="0"/>
-                <w:i w:val="0"/>
-                <w:sz w:val="19"/>
-              </w:rPr>
-              <w:t>15 Oct 2026 22:31</w:t>
-            </w:r>
-          </w:p>
-        </w:tc>
-        <w:tc>
-          <w:tcPr>
-            <w:tcW w:type="dxa" w:w="1700"/>
-            <w:shd w:val="clear" w:color="auto" w:fill="EEF3FA"/>
-            <w:tcMar>
-              <w:top w:w="80" w:type="dxa"/>
-              <w:bottom w:w="80" w:type="dxa"/>
-              <w:left w:w="100" w:type="dxa"/>
-              <w:right w:w="100" w:type="dxa"/>
-            </w:tcMar>
-          </w:tcPr>
-          <w:p>
-            <w:pPr>
-              <w:spacing w:after="0"/>
-            </w:pPr>
-            <w:r>
-              <w:rPr>
-                <w:rFonts w:ascii="Calibri" w:hAnsi="Calibri"/>
-                <w:b w:val="0"/>
-                <w:i w:val="0"/>
-                <w:sz w:val="19"/>
-              </w:rPr>
-              <w:t>Kush Aghera</w:t>
-            </w:r>
-          </w:p>
-        </w:tc>
-        <w:tc>
-          <w:tcPr>
-            <w:tcW w:type="dxa" w:w="2900"/>
-            <w:shd w:val="clear" w:color="auto" w:fill="EEF3FA"/>
-            <w:tcMar>
-              <w:top w:w="80" w:type="dxa"/>
-              <w:bottom w:w="80" w:type="dxa"/>
-              <w:left w:w="100" w:type="dxa"/>
-              <w:right w:w="100" w:type="dxa"/>
-            </w:tcMar>
-          </w:tcPr>
-          <w:p>
-            <w:pPr>
-              <w:spacing w:after="0"/>
-            </w:pPr>
-            <w:r>
-              <w:rPr>
-                <w:rFonts w:ascii="Calibri" w:hAnsi="Calibri"/>
-                <w:b w:val="0"/>
-                <w:i w:val="0"/>
-                <w:sz w:val="19"/>
-              </w:rPr>
-              <w:t>add review pdfs</w:t>
-            </w:r>
-          </w:p>
-        </w:tc>
-        <w:tc>
-          <w:tcPr>
-            <w:tcW w:type="dxa" w:w="1760"/>
-            <w:shd w:val="clear" w:color="auto" w:fill="EEF3FA"/>
-            <w:tcMar>
-              <w:top w:w="80" w:type="dxa"/>
-              <w:bottom w:w="80" w:type="dxa"/>
-              <w:left w:w="100" w:type="dxa"/>
-              <w:right w:w="100" w:type="dxa"/>
-            </w:tcMar>
-          </w:tcPr>
-          <w:p>
-            <w:pPr>
-              <w:spacing w:after="0"/>
-            </w:pPr>
-            <w:r>
-              <w:rPr>
-                <w:rFonts w:ascii="Calibri" w:hAnsi="Calibri"/>
-                <w:b w:val="0"/>
-                <w:i w:val="0"/>
-                <w:sz w:val="19"/>
-              </w:rPr>
-              <w:t>2 files (binary: .docx / .pdf / .png)</w:t>
-            </w:r>
-          </w:p>
-        </w:tc>
-      </w:tr>
-      <w:tr>
-        <w:trPr>
-          <w:cantSplit/>
-        </w:trPr>
-        <w:tc>
-          <w:tcPr>
-            <w:tcW w:type="dxa" w:w="1100"/>
-            <w:shd w:val="clear" w:color="auto" w:fill="FFFFFF"/>
-            <w:tcMar>
-              <w:top w:w="80" w:type="dxa"/>
-              <w:bottom w:w="80" w:type="dxa"/>
-              <w:left w:w="100" w:type="dxa"/>
-              <w:right w:w="100" w:type="dxa"/>
-            </w:tcMar>
-          </w:tcPr>
-          <w:p>
-            <w:pPr>
-              <w:spacing w:after="0"/>
-            </w:pPr>
-            <w:r>
-              <w:rPr>
-                <w:rFonts w:ascii="Calibri" w:hAnsi="Calibri"/>
-                <w:b/>
-                <w:i w:val="0"/>
-                <w:sz w:val="19"/>
-              </w:rPr>
-              <w:t>ff40930</w:t>
-            </w:r>
-          </w:p>
-        </w:tc>
-        <w:tc>
-          <w:tcPr>
-            <w:tcW w:type="dxa" w:w="1900"/>
-            <w:shd w:val="clear" w:color="auto" w:fill="FFFFFF"/>
-            <w:tcMar>
-              <w:top w:w="80" w:type="dxa"/>
-              <w:bottom w:w="80" w:type="dxa"/>
-              <w:left w:w="100" w:type="dxa"/>
-              <w:right w:w="100" w:type="dxa"/>
-            </w:tcMar>
-          </w:tcPr>
-          <w:p>
-            <w:pPr>
-              <w:spacing w:after="0"/>
-            </w:pPr>
-            <w:r>
-              <w:rPr>
-                <w:rFonts w:ascii="Calibri" w:hAnsi="Calibri"/>
-                <w:b w:val="0"/>
-                <w:i w:val="0"/>
-                <w:sz w:val="19"/>
-              </w:rPr>
-              <w:t>15 Oct 2026 22:44</w:t>
-            </w:r>
-          </w:p>
-        </w:tc>
-        <w:tc>
-          <w:tcPr>
-            <w:tcW w:type="dxa" w:w="1700"/>
-            <w:shd w:val="clear" w:color="auto" w:fill="FFFFFF"/>
-            <w:tcMar>
-              <w:top w:w="80" w:type="dxa"/>
-              <w:bottom w:w="80" w:type="dxa"/>
-              <w:left w:w="100" w:type="dxa"/>
-              <w:right w:w="100" w:type="dxa"/>
-            </w:tcMar>
-          </w:tcPr>
-          <w:p>
-            <w:pPr>
-              <w:spacing w:after="0"/>
-            </w:pPr>
-            <w:r>
-              <w:rPr>
-                <w:rFonts w:ascii="Calibri" w:hAnsi="Calibri"/>
-                <w:b w:val="0"/>
-                <w:i w:val="0"/>
-                <w:sz w:val="19"/>
-              </w:rPr>
-              <w:t>Kush Aghera</w:t>
-            </w:r>
-          </w:p>
-        </w:tc>
-        <w:tc>
-          <w:tcPr>
-            <w:tcW w:type="dxa" w:w="2900"/>
-            <w:shd w:val="clear" w:color="auto" w:fill="FFFFFF"/>
-            <w:tcMar>
-              <w:top w:w="80" w:type="dxa"/>
-              <w:bottom w:w="80" w:type="dxa"/>
-              <w:left w:w="100" w:type="dxa"/>
-              <w:right w:w="100" w:type="dxa"/>
-            </w:tcMar>
-          </w:tcPr>
-          <w:p>
-            <w:pPr>
-              <w:spacing w:after="0"/>
-            </w:pPr>
-            <w:r>
-              <w:rPr>
-                <w:rFonts w:ascii="Calibri" w:hAnsi="Calibri"/>
-                <w:b w:val="0"/>
-                <w:i w:val="0"/>
-                <w:sz w:val="19"/>
-              </w:rPr>
-              <w:t>add review three</w:t>
-            </w:r>
-          </w:p>
-        </w:tc>
-        <w:tc>
-          <w:tcPr>
-            <w:tcW w:type="dxa" w:w="1760"/>
-            <w:shd w:val="clear" w:color="auto" w:fill="FFFFFF"/>
-            <w:tcMar>
-              <w:top w:w="80" w:type="dxa"/>
-              <w:bottom w:w="80" w:type="dxa"/>
-              <w:left w:w="100" w:type="dxa"/>
-              <w:right w:w="100" w:type="dxa"/>
-            </w:tcMar>
-          </w:tcPr>
-          <w:p>
-            <w:pPr>
-              <w:spacing w:after="0"/>
-            </w:pPr>
-            <w:r>
-              <w:rPr>
-                <w:rFonts w:ascii="Calibri" w:hAnsi="Calibri"/>
-                <w:b w:val="0"/>
-                <w:i w:val="0"/>
-                <w:sz w:val="19"/>
-              </w:rPr>
-              <w:t>2 files (binary: .docx / .pdf / .png)</w:t>
-            </w:r>
-          </w:p>
-        </w:tc>
-      </w:tr>
-    </w:tbl>
-    <w:p>
-      <w:pPr>
-        <w:spacing w:after="80"/>
-      </w:pPr>
     </w:p>
     <w:sectPr>
       <w:pgSz w:w="12240" w:h="15840"/>

</xml_diff>